<commit_message>
Add supporting scripts and update template/builder
https://claude.ai/code/session_01XNwruHkNzzkACBuMPFnptn
</commit_message>
<xml_diff>
--- a/contract_template.docx
+++ b/contract_template.docx
@@ -6123,27 +6123,23 @@
         <w:rPr>
           <w:b/>
         </w:rPr>
-        <w:t>{{CUSTOMER_NAME}}</w:t>
-      </w:r>
-      <w:r>
-        <w:t xml:space="preserve"> of </w:t>
-      </w:r>
-      <w:r>
-        <w:rPr>
-          <w:b/>
-        </w:rPr>
-        <w:t>{{CUSTOMER_ADDRESS}}</w:t>
+        <w:t>{{CUSTOMER_NAME}} of {{CUSTOMER_ADDRESS}}</w:t>
+        <w:tab/>
+        <w:t xml:space="preserve"> </w:t>
+      </w:r>
+      <w:r/>
+      <w:r>
+        <w:rPr>
+          <w:b/>
+        </w:rPr>
       </w:r>
       <w:r>
         <w:rPr>
           <w:rFonts w:ascii="Cambria" w:eastAsia="Cambria" w:hAnsi="Cambria" w:cs="Cambria"/>
           <w:vertAlign w:val="subscript"/>
         </w:rPr>
-        <w:tab/>
-      </w:r>
-      <w:r>
-        <w:t xml:space="preserve"> </w:t>
-      </w:r>
+      </w:r>
+      <w:r/>
     </w:p>
     <w:p>
       <w:pPr>
@@ -6399,29 +6395,21 @@
         <w:rPr>
           <w:b/>
         </w:rPr>
-        <w:t>The Purchaser</w:t>
-      </w:r>
-      <w:r>
-        <w:t xml:space="preserve"> is interested in </w:t>
-      </w:r>
-      <w:r>
-        <w:rPr>
-          <w:b/>
-        </w:rPr>
-        <w:t>{{NUM_PLOTS_WORDS}}</w:t>
-      </w:r>
-      <w:r>
-        <w:t xml:space="preserve"> plots of land measuring </w:t>
-      </w:r>
-      <w:r>
-        <w:rPr>
-          <w:b/>
-        </w:rPr>
-        <w:t>{{PLOT_SIZE_SQM}} Square Meters</w:t>
-      </w:r>
-      <w:r>
-        <w:t xml:space="preserve"> which is the subject matter of this transaction and forms part of the vast parcel of land that makes up </w:t>
-      </w:r>
+        <w:t xml:space="preserve">The Purchaser is interested in {{NUM_PLOTS_WORDS}} plots of land measuring {{PLOT_SIZE_SQM}} Square Meters which is the subject matter of this transaction and forms part of the vast parcel of land that makes up </w:t>
+      </w:r>
+      <w:r/>
+      <w:r>
+        <w:rPr>
+          <w:b/>
+        </w:rPr>
+      </w:r>
+      <w:r/>
+      <w:r>
+        <w:rPr>
+          <w:b/>
+        </w:rPr>
+      </w:r>
+      <w:r/>
     </w:p>
     <w:p>
       <w:pPr>
@@ -6571,7 +6559,7 @@
         <w:ind w:left="-3"/>
       </w:pPr>
       <w:r>
-        <w:t xml:space="preserve">out of which the sum of ₦{{DEPOSIT_DIGITS}} ({{DEPOSIT_WORDS}}) has been paid as deposit by the Purchaser to the Vendor (the receipt of which the Vendor acknowledges), the Vendor covenants to assign {{NUM_PLOTS_WORDS}} plot of land measuring {{PLOT_SIZE_SQM}} Square Meters located within Alafia Gardens situate at Wara Community, Along Eyenkorin Express Road, Ilorin, Kwara State to the Purchaser, subject to the terms and conditions contained in this Contract of Sale. </w:t>
+        <w:t xml:space="preserve">out of which the sum of ₦{{DEPOSIT_DIGITS}} ({{DEPOSIT_WORDS}}) has been paid as deposit by the Purchaser to the Vendor (the receipt of which the Vendor acknowledges), the Vendor covenants to assign {{NUM_PLOTS_DIGITS_UPPER}} plot of land measuring {{PLOT_SIZE_SQM}} Square Meters located within Alafia Gardens situate at Wara Community, Along Eyenkorin Express Road, Ilorin, Kwara State to the Purchaser, subject to the terms and conditions contained in this Contract of Sale. </w:t>
       </w:r>
       <w:r>
         <w:rPr>
@@ -6683,7 +6671,7 @@
         <w:ind w:hanging="360"/>
       </w:pPr>
       <w:r>
-        <w:t xml:space="preserve">To promptly pay  the  balance  of  ₦{{BALANCE_DIGITS}}  ({{BALANCE_WORDS}}), without default as at when due for the stipulated period which will commence from the day the purchaser made the first instalment being the {{PAYMENT_START_DATE}} and which shall be for a period of {{PAYMENT_DURATION_MONTHS}} months from the {{PAYMENT_START_DATE}} to the {{PAYMENT_END_DATE}} </w:t>
+        <w:t xml:space="preserve">To promptly pay  the  balance  of  ₦{{BALANCE_DIGITS}} ({{BALANCE_WORDS}}), without default as at when due for the stipulated period which will commence from the day the purchaser made the first instalment being the {{PAYMENT_START_DATE}} and which shall be for a period of {{PAYMENT_DURATION_MONTHS}}months from the {{PAYMENT_START_DATE}} to the {{PAYMENT_END_DATE}} </w:t>
       </w:r>
       <w:r/>
       <w:proofErr w:type="gramStart"/>
@@ -7516,35 +7504,26 @@
         <w:ind w:hanging="360"/>
       </w:pPr>
       <w:r>
-        <w:t xml:space="preserve">To physically allocate </w:t>
-      </w:r>
-      <w:r>
-        <w:rPr>
-          <w:b/>
-        </w:rPr>
-        <w:t>{{NUM_PLOTS_WORDS}}</w:t>
-      </w:r>
-      <w:r>
-        <w:t xml:space="preserve"> plot of land measuring </w:t>
-      </w:r>
-      <w:r>
-        <w:rPr>
-          <w:b/>
-        </w:rPr>
-        <w:t>{{PLOT_SIZE_SQM}} Square Meters</w:t>
-      </w:r>
-      <w:r>
-        <w:t xml:space="preserve"> to the Purchaser upon further payment of at least </w:t>
-      </w:r>
-      <w:r>
-        <w:rPr>
-          <w:b/>
-        </w:rPr>
-        <w:t>50%</w:t>
-      </w:r>
-      <w:r>
-        <w:t xml:space="preserve"> of the infrastructure fee, full payment of other developmental fees, payment for architectural drawing (whether prepared by the Vendor or external person or body) as stated in Clause 5(g) &amp; (h) herein and the execution of payment agreement (where applicable), indemnity and Construction </w:t>
-      </w:r>
+        <w:t xml:space="preserve">To physically allocate {{NUM_PLOTS_DIGITS_UPPER}} plot of land measuring {{PLOT_SIZE_SQM}} Square Meters to the Purchaser upon further payment of at least 50% of the infrastructure fee, full payment of other developmental fees, payment for architectural drawing (whether prepared by the Vendor or external person or body) as stated in Clause 5(g) &amp; (h) herein and the execution of payment agreement (where applicable), indemnity and Construction </w:t>
+      </w:r>
+      <w:r>
+        <w:rPr>
+          <w:b/>
+        </w:rPr>
+      </w:r>
+      <w:r/>
+      <w:r>
+        <w:rPr>
+          <w:b/>
+        </w:rPr>
+      </w:r>
+      <w:r/>
+      <w:r>
+        <w:rPr>
+          <w:b/>
+        </w:rPr>
+      </w:r>
+      <w:r/>
     </w:p>
     <w:p>
       <w:pPr>
@@ -8154,7 +8133,7 @@
         <w:jc w:val="left"/>
       </w:pPr>
       <w:r>
-        <w:t xml:space="preserve">That the agreed price for {{NUM_PLOTS_WORDS}} plot of land measuring {{PLOT_SIZE_SQM}} Square Meters is ₦{{TOTAL_PRICE_DIGITS}} ({{TOTAL_PRICE_WORDS}}) only. </w:t>
+        <w:t xml:space="preserve">That the agreed price for {{NUM_PLOTS_DIGITS_UPPER}} plot of land measuring {{PLOT_SIZE_SQM}} Square Meters is ₦{{TOTAL_PRICE_DIGITS}} ({{TOTAL_PRICE_WORDS}} only. </w:t>
       </w:r>
       <w:r>
         <w:rPr>

</xml_diff>

<commit_message>
Refine contract generator: cleaner fields, auto-derive plot caps, add README
https://claude.ai/code/session_01XNwruHkNzzkACBuMPFnptn
</commit_message>
<xml_diff>
--- a/contract_template.docx
+++ b/contract_template.docx
@@ -6123,23 +6123,27 @@
         <w:rPr>
           <w:b/>
         </w:rPr>
-        <w:t>{{CUSTOMER_NAME}} of {{CUSTOMER_ADDRESS}}</w:t>
-        <w:tab/>
-        <w:t xml:space="preserve"> </w:t>
-      </w:r>
-      <w:r/>
-      <w:r>
-        <w:rPr>
-          <w:b/>
-        </w:rPr>
+        <w:t>{{CUSTOMER_NAME}}</w:t>
+      </w:r>
+      <w:r>
+        <w:t xml:space="preserve"> of </w:t>
+      </w:r>
+      <w:r>
+        <w:rPr>
+          <w:b/>
+        </w:rPr>
+        <w:t>{{CUSTOMER_ADDRESS}}</w:t>
       </w:r>
       <w:r>
         <w:rPr>
           <w:rFonts w:ascii="Cambria" w:eastAsia="Cambria" w:hAnsi="Cambria" w:cs="Cambria"/>
           <w:vertAlign w:val="subscript"/>
         </w:rPr>
-      </w:r>
-      <w:r/>
+        <w:tab/>
+      </w:r>
+      <w:r>
+        <w:t xml:space="preserve"> </w:t>
+      </w:r>
     </w:p>
     <w:p>
       <w:pPr>
@@ -6395,21 +6399,29 @@
         <w:rPr>
           <w:b/>
         </w:rPr>
-        <w:t xml:space="preserve">The Purchaser is interested in {{NUM_PLOTS_WORDS}} plots of land measuring {{PLOT_SIZE_SQM}} Square Meters which is the subject matter of this transaction and forms part of the vast parcel of land that makes up </w:t>
-      </w:r>
-      <w:r/>
-      <w:r>
-        <w:rPr>
-          <w:b/>
-        </w:rPr>
-      </w:r>
-      <w:r/>
-      <w:r>
-        <w:rPr>
-          <w:b/>
-        </w:rPr>
-      </w:r>
-      <w:r/>
+        <w:t>The Purchaser</w:t>
+      </w:r>
+      <w:r>
+        <w:t xml:space="preserve"> is interested in </w:t>
+      </w:r>
+      <w:r>
+        <w:rPr>
+          <w:b/>
+        </w:rPr>
+        <w:t>{{NUM_PLOTS_WORDS}}</w:t>
+      </w:r>
+      <w:r>
+        <w:t xml:space="preserve"> plots of land measuring </w:t>
+      </w:r>
+      <w:r>
+        <w:rPr>
+          <w:b/>
+        </w:rPr>
+        <w:t>{{PLOT_SIZE_SQM}} Square Meters</w:t>
+      </w:r>
+      <w:r>
+        <w:t xml:space="preserve"> which is the subject matter of this transaction and forms part of the vast parcel of land that makes up </w:t>
+      </w:r>
     </w:p>
     <w:p>
       <w:pPr>
@@ -6559,7 +6571,7 @@
         <w:ind w:left="-3"/>
       </w:pPr>
       <w:r>
-        <w:t xml:space="preserve">out of which the sum of ₦{{DEPOSIT_DIGITS}} ({{DEPOSIT_WORDS}}) has been paid as deposit by the Purchaser to the Vendor (the receipt of which the Vendor acknowledges), the Vendor covenants to assign {{NUM_PLOTS_DIGITS_UPPER}} plot of land measuring {{PLOT_SIZE_SQM}} Square Meters located within Alafia Gardens situate at Wara Community, Along Eyenkorin Express Road, Ilorin, Kwara State to the Purchaser, subject to the terms and conditions contained in this Contract of Sale. </w:t>
+        <w:t xml:space="preserve">out of which the sum of ₦{{DEPOSIT_DIGITS}} ({{DEPOSIT_WORDS}}) has been paid as deposit by the Purchaser to the Vendor (the receipt of which the Vendor acknowledges), the Vendor covenants to assign {{NUM_PLOTS_WORDS}} plot of land measuring {{PLOT_SIZE_SQM}} Square Meters located within Alafia Gardens situate at Wara Community, Along Eyenkorin Express Road, Ilorin, Kwara State to the Purchaser, subject to the terms and conditions contained in this Contract of Sale. </w:t>
       </w:r>
       <w:r>
         <w:rPr>
@@ -6671,7 +6683,7 @@
         <w:ind w:hanging="360"/>
       </w:pPr>
       <w:r>
-        <w:t xml:space="preserve">To promptly pay  the  balance  of  ₦{{BALANCE_DIGITS}} ({{BALANCE_WORDS}}), without default as at when due for the stipulated period which will commence from the day the purchaser made the first instalment being the {{PAYMENT_START_DATE}} and which shall be for a period of {{PAYMENT_DURATION_MONTHS}}months from the {{PAYMENT_START_DATE}} to the {{PAYMENT_END_DATE}} </w:t>
+        <w:t xml:space="preserve">To promptly pay  the  balance  of  ₦{{BALANCE_DIGITS}}  ({{BALANCE_WORDS}}), without default as at when due for the stipulated period which will commence from the day the purchaser made the first instalment being the {{PAYMENT_START_DATE}} and which shall be for a period of {{PAYMENT_DURATION_MONTHS}}months from the {{PAYMENT_START_DATE}} to the {{PAYMENT_END_DATE}} </w:t>
       </w:r>
       <w:r/>
       <w:proofErr w:type="gramStart"/>
@@ -7504,26 +7516,35 @@
         <w:ind w:hanging="360"/>
       </w:pPr>
       <w:r>
-        <w:t xml:space="preserve">To physically allocate {{NUM_PLOTS_DIGITS_UPPER}} plot of land measuring {{PLOT_SIZE_SQM}} Square Meters to the Purchaser upon further payment of at least 50% of the infrastructure fee, full payment of other developmental fees, payment for architectural drawing (whether prepared by the Vendor or external person or body) as stated in Clause 5(g) &amp; (h) herein and the execution of payment agreement (where applicable), indemnity and Construction </w:t>
-      </w:r>
-      <w:r>
-        <w:rPr>
-          <w:b/>
-        </w:rPr>
-      </w:r>
-      <w:r/>
-      <w:r>
-        <w:rPr>
-          <w:b/>
-        </w:rPr>
-      </w:r>
-      <w:r/>
-      <w:r>
-        <w:rPr>
-          <w:b/>
-        </w:rPr>
-      </w:r>
-      <w:r/>
+        <w:t xml:space="preserve">To physically allocate </w:t>
+      </w:r>
+      <w:r>
+        <w:rPr>
+          <w:b/>
+        </w:rPr>
+        <w:t>{{NUM_PLOTS_WORDS}}</w:t>
+      </w:r>
+      <w:r>
+        <w:t xml:space="preserve"> plot of land measuring </w:t>
+      </w:r>
+      <w:r>
+        <w:rPr>
+          <w:b/>
+        </w:rPr>
+        <w:t>{{PLOT_SIZE_SQM}} Square Meters</w:t>
+      </w:r>
+      <w:r>
+        <w:t xml:space="preserve"> to the Purchaser upon further payment of at least </w:t>
+      </w:r>
+      <w:r>
+        <w:rPr>
+          <w:b/>
+        </w:rPr>
+        <w:t>50%</w:t>
+      </w:r>
+      <w:r>
+        <w:t xml:space="preserve"> of the infrastructure fee, full payment of other developmental fees, payment for architectural drawing (whether prepared by the Vendor or external person or body) as stated in Clause 5(g) &amp; (h) herein and the execution of payment agreement (where applicable), indemnity and Construction </w:t>
+      </w:r>
     </w:p>
     <w:p>
       <w:pPr>
@@ -8133,7 +8154,7 @@
         <w:jc w:val="left"/>
       </w:pPr>
       <w:r>
-        <w:t xml:space="preserve">That the agreed price for {{NUM_PLOTS_DIGITS_UPPER}} plot of land measuring {{PLOT_SIZE_SQM}} Square Meters is ₦{{TOTAL_PRICE_DIGITS}} ({{TOTAL_PRICE_WORDS}} only. </w:t>
+        <w:t xml:space="preserve">That the agreed price for {{NUM_PLOTS_WORDS}} plot of land measuring {{PLOT_SIZE_SQM}} Square Meters is ₦{{TOTAL_PRICE_DIGITS}} ({{TOTAL_PRICE_WORDS}}) only. </w:t>
       </w:r>
       <w:r>
         <w:rPr>

</xml_diff>

<commit_message>
Sync latest contract template and generator updates
https://claude.ai/code/session_01XNwruHkNzzkACBuMPFnptn
</commit_message>
<xml_diff>
--- a/contract_template.docx
+++ b/contract_template.docx
@@ -6123,23 +6123,27 @@
         <w:rPr>
           <w:b/>
         </w:rPr>
-        <w:t>{{CUSTOMER_NAME}} of {{CUSTOMER_ADDRESS}}</w:t>
-        <w:tab/>
-        <w:t xml:space="preserve"> </w:t>
-      </w:r>
-      <w:r/>
-      <w:r>
-        <w:rPr>
-          <w:b/>
-        </w:rPr>
+        <w:t>{{CUSTOMER_NAME}}</w:t>
+      </w:r>
+      <w:r>
+        <w:t xml:space="preserve"> of </w:t>
+      </w:r>
+      <w:r>
+        <w:rPr>
+          <w:b/>
+        </w:rPr>
+        <w:t>{{CUSTOMER_ADDRESS}}</w:t>
       </w:r>
       <w:r>
         <w:rPr>
           <w:rFonts w:ascii="Cambria" w:eastAsia="Cambria" w:hAnsi="Cambria" w:cs="Cambria"/>
           <w:vertAlign w:val="subscript"/>
         </w:rPr>
-      </w:r>
-      <w:r/>
+        <w:tab/>
+      </w:r>
+      <w:r>
+        <w:t xml:space="preserve"> </w:t>
+      </w:r>
     </w:p>
     <w:p>
       <w:pPr>
@@ -8133,7 +8137,7 @@
         <w:jc w:val="left"/>
       </w:pPr>
       <w:r>
-        <w:t xml:space="preserve">That the agreed price for {{NUM_PLOTS_WORDS}} plot of land measuring {{PLOT_SIZE_SQM}} Square Meters is ₦3,000,000,000 (THREE MILLION NAIRA ONLY) only. </w:t>
+        <w:t xml:space="preserve">That the agreed price for {{NUM_PLOTS_WORDS}} plot of land measuring {{PLOT_SIZE_SQM}} Square Meters is ₦{{TOTAL_PRICE_DIGITS}} ({{TOTAL_PRICE_WORDS}}) only. </w:t>
       </w:r>
       <w:r>
         <w:rPr>

</xml_diff>

<commit_message>
Fix cover page replacement — handle text boxes and drawing elements in XML
https://claude.ai/code/session_01XNwruHkNzzkACBuMPFnptn
</commit_message>
<xml_diff>
--- a/contract_template.docx
+++ b/contract_template.docx
@@ -1133,7 +1133,7 @@
                                   <w:b/>
                                   <w:sz w:val="32"/>
                                 </w:rPr>
-                                <w:t>MR. OJOLOWO BOLUWATIFE</w:t>
+                                <w:t>{{CUSTOMER_NAME}}</w:t>
                               </w:r>
                             </w:p>
                           </w:txbxContent>
@@ -4448,7 +4448,7 @@
                             <w:b/>
                             <w:sz w:val="32"/>
                           </w:rPr>
-                          <w:t>MR. OJOLOWO BOLUWATIFE</w:t>
+                          <w:t>{{CUSTOMER_NAME}}</w:t>
                         </w:r>
                       </w:p>
                     </w:txbxContent>

</xml_diff>

<commit_message>
Fix cover page plot/size replacement; restore date line to blank dots; remove date fields from form
https://claude.ai/code/session_01XNwruHkNzzkACBuMPFnptn
</commit_message>
<xml_diff>
--- a/contract_template.docx
+++ b/contract_template.docx
@@ -84,7 +84,7 @@
                                   <w:b/>
                                   <w:sz w:val="44"/>
                                 </w:rPr>
-                                <w:t xml:space="preserve"> </w:t>
+                                <w:t xml:space="preserve"> CONTRACT OF SALE     BETWEEN     LANDCULTURE INVESTMENT LTD  The VENDOR)(     AND     {{CUSTOMER_NAME}}  (The PURCHASER)      IN RESPECT OF {{NUM_PLOTS_WORDS_UPPER}} PLOTS OF LAND MEASURING {{PLOT_SIZE_SQM}} SQUARE METERS SITUATE AT ALAFIA GARDENS, LOCATED AT WARA COMMUNITY, ALONG EIYENKORIN EXPRESS ROAD KWARA STATE.  ...............................................................................................      PREPARED BY  D. O AROWOSAFE Esq.  FOR: LEGAL DEPARTMENT,  LANDCULTURE INVESTMENT LTD,  PLOT 6, OLD JEBBA ROAD, BESIDE IPMAN BUILDING,  SANGO, ILORIN, KWARA STATE.  CONTRACT OF SALE     BETWEEN     LANDCULTURE INVESTMENT LTD  The VENDOR)(     AND     {{CUSTOMER_NAME}}  (The PURCHASER)      IN RESPECT OF {{NUM_PLOTS_WORDS_UPPER}} PLOTS OF LAND MEASURING {{PLOT_SIZE_SQM}} SQUARE METERS SITUATE AT ALAFIA GARDENS, LOCATED AT WARA COMMUNITY, ALONG EIYENKORIN EXPRESS ROAD KWARA STATE.  ...............................................................................................      PREPARED BY  D. O AROWOSAFE Esq.  FOR: LEGAL DEPARTMENT,  LANDCULTURE INVESTMENT LTD,  PLOT 6, OLD JEBBA ROAD, BESIDE IPMAN BUILDING,  SANGO, ILORIN, KWARA STATE. </w:t>
                               </w:r>
                             </w:p>
                           </w:txbxContent>
@@ -122,7 +122,7 @@
                                   <w:b/>
                                   <w:sz w:val="44"/>
                                 </w:rPr>
-                                <w:t>CONTRACT OF SALE</w:t>
+                                <w:t/>
                               </w:r>
                             </w:p>
                           </w:txbxContent>
@@ -160,7 +160,7 @@
                                   <w:b/>
                                   <w:sz w:val="44"/>
                                 </w:rPr>
-                                <w:t xml:space="preserve"> </w:t>
+                                <w:t xml:space="preserve"/>
                               </w:r>
                             </w:p>
                           </w:txbxContent>
@@ -193,7 +193,7 @@
                                 <w:jc w:val="left"/>
                               </w:pPr>
                               <w:r>
-                                <w:t xml:space="preserve"> </w:t>
+                                <w:t xml:space="preserve"/>
                               </w:r>
                             </w:p>
                           </w:txbxContent>
@@ -226,7 +226,7 @@
                                 <w:jc w:val="left"/>
                               </w:pPr>
                               <w:r>
-                                <w:t xml:space="preserve"> </w:t>
+                                <w:t xml:space="preserve"/>
                               </w:r>
                             </w:p>
                           </w:txbxContent>
@@ -259,7 +259,7 @@
                                 <w:jc w:val="left"/>
                               </w:pPr>
                               <w:r>
-                                <w:t xml:space="preserve"> </w:t>
+                                <w:t xml:space="preserve"/>
                               </w:r>
                             </w:p>
                           </w:txbxContent>
@@ -292,7 +292,7 @@
                                 <w:jc w:val="left"/>
                               </w:pPr>
                               <w:r>
-                                <w:t xml:space="preserve"> </w:t>
+                                <w:t xml:space="preserve"/>
                               </w:r>
                             </w:p>
                           </w:txbxContent>
@@ -329,7 +329,7 @@
                                   <w:rFonts w:ascii="Georgia" w:eastAsia="Georgia" w:hAnsi="Georgia" w:cs="Georgia"/>
                                   <w:b/>
                                 </w:rPr>
-                                <w:t>BETWEEN</w:t>
+                                <w:t/>
                               </w:r>
                             </w:p>
                           </w:txbxContent>
@@ -366,7 +366,7 @@
                                   <w:rFonts w:ascii="Georgia" w:eastAsia="Georgia" w:hAnsi="Georgia" w:cs="Georgia"/>
                                   <w:b/>
                                 </w:rPr>
-                                <w:t xml:space="preserve"> </w:t>
+                                <w:t xml:space="preserve"/>
                               </w:r>
                             </w:p>
                           </w:txbxContent>
@@ -399,7 +399,7 @@
                                 <w:jc w:val="left"/>
                               </w:pPr>
                               <w:r>
-                                <w:t xml:space="preserve"> </w:t>
+                                <w:t xml:space="preserve"/>
                               </w:r>
                             </w:p>
                           </w:txbxContent>
@@ -432,7 +432,7 @@
                                 <w:jc w:val="left"/>
                               </w:pPr>
                               <w:r>
-                                <w:t xml:space="preserve"> </w:t>
+                                <w:t xml:space="preserve"/>
                               </w:r>
                             </w:p>
                           </w:txbxContent>
@@ -465,7 +465,7 @@
                                 <w:jc w:val="left"/>
                               </w:pPr>
                               <w:r>
-                                <w:t xml:space="preserve"> </w:t>
+                                <w:t xml:space="preserve"/>
                               </w:r>
                             </w:p>
                           </w:txbxContent>
@@ -498,7 +498,7 @@
                                 <w:jc w:val="left"/>
                               </w:pPr>
                               <w:r>
-                                <w:t xml:space="preserve"> </w:t>
+                                <w:t xml:space="preserve"/>
                               </w:r>
                             </w:p>
                           </w:txbxContent>
@@ -536,7 +536,7 @@
                                   <w:b/>
                                   <w:sz w:val="32"/>
                                 </w:rPr>
-                                <w:t>LANDCULTURE INVESTMENT LTD</w:t>
+                                <w:t/>
                               </w:r>
                             </w:p>
                           </w:txbxContent>
@@ -574,7 +574,7 @@
                                   <w:b/>
                                   <w:sz w:val="32"/>
                                 </w:rPr>
-                                <w:t xml:space="preserve"> </w:t>
+                                <w:t xml:space="preserve"/>
                               </w:r>
                             </w:p>
                           </w:txbxContent>
@@ -607,7 +607,7 @@
                                 <w:jc w:val="left"/>
                               </w:pPr>
                               <w:r>
-                                <w:t xml:space="preserve"> </w:t>
+                                <w:t xml:space="preserve"/>
                               </w:r>
                             </w:p>
                           </w:txbxContent>
@@ -644,7 +644,7 @@
                                   <w:rFonts w:ascii="Georgia" w:eastAsia="Georgia" w:hAnsi="Georgia" w:cs="Georgia"/>
                                   <w:sz w:val="22"/>
                                 </w:rPr>
-                                <w:t>The VENDOR</w:t>
+                                <w:t/>
                               </w:r>
                             </w:p>
                           </w:txbxContent>
@@ -681,7 +681,7 @@
                                   <w:rFonts w:ascii="Georgia" w:eastAsia="Georgia" w:hAnsi="Georgia" w:cs="Georgia"/>
                                   <w:sz w:val="22"/>
                                 </w:rPr>
-                                <w:t>)</w:t>
+                                <w:t/>
                               </w:r>
                             </w:p>
                           </w:txbxContent>
@@ -718,7 +718,7 @@
                                   <w:rFonts w:ascii="Georgia" w:eastAsia="Georgia" w:hAnsi="Georgia" w:cs="Georgia"/>
                                   <w:sz w:val="22"/>
                                 </w:rPr>
-                                <w:t>(</w:t>
+                                <w:t/>
                               </w:r>
                             </w:p>
                           </w:txbxContent>
@@ -755,7 +755,7 @@
                                   <w:rFonts w:ascii="Georgia" w:eastAsia="Georgia" w:hAnsi="Georgia" w:cs="Georgia"/>
                                   <w:sz w:val="22"/>
                                 </w:rPr>
-                                <w:t xml:space="preserve"> </w:t>
+                                <w:t xml:space="preserve"/>
                               </w:r>
                             </w:p>
                           </w:txbxContent>
@@ -788,7 +788,7 @@
                                 <w:jc w:val="left"/>
                               </w:pPr>
                               <w:r>
-                                <w:t xml:space="preserve"> </w:t>
+                                <w:t xml:space="preserve"/>
                               </w:r>
                             </w:p>
                           </w:txbxContent>
@@ -821,7 +821,7 @@
                                 <w:jc w:val="left"/>
                               </w:pPr>
                               <w:r>
-                                <w:t xml:space="preserve"> </w:t>
+                                <w:t xml:space="preserve"/>
                               </w:r>
                             </w:p>
                           </w:txbxContent>
@@ -854,7 +854,7 @@
                                 <w:jc w:val="left"/>
                               </w:pPr>
                               <w:r>
-                                <w:t xml:space="preserve"> </w:t>
+                                <w:t xml:space="preserve"/>
                               </w:r>
                             </w:p>
                           </w:txbxContent>
@@ -887,7 +887,7 @@
                                 <w:jc w:val="left"/>
                               </w:pPr>
                               <w:r>
-                                <w:t xml:space="preserve"> </w:t>
+                                <w:t xml:space="preserve"/>
                               </w:r>
                             </w:p>
                           </w:txbxContent>
@@ -925,7 +925,7 @@
                                   <w:b/>
                                   <w:sz w:val="20"/>
                                 </w:rPr>
-                                <w:t>AND</w:t>
+                                <w:t/>
                               </w:r>
                             </w:p>
                           </w:txbxContent>
@@ -963,7 +963,7 @@
                                   <w:b/>
                                   <w:sz w:val="20"/>
                                 </w:rPr>
-                                <w:t xml:space="preserve"> </w:t>
+                                <w:t xml:space="preserve"/>
                               </w:r>
                             </w:p>
                           </w:txbxContent>
@@ -996,7 +996,7 @@
                                 <w:jc w:val="left"/>
                               </w:pPr>
                               <w:r>
-                                <w:t xml:space="preserve"> </w:t>
+                                <w:t xml:space="preserve"/>
                               </w:r>
                             </w:p>
                           </w:txbxContent>
@@ -1029,7 +1029,7 @@
                                 <w:jc w:val="left"/>
                               </w:pPr>
                               <w:r>
-                                <w:t xml:space="preserve"> </w:t>
+                                <w:t xml:space="preserve"/>
                               </w:r>
                             </w:p>
                           </w:txbxContent>
@@ -1062,7 +1062,7 @@
                                 <w:jc w:val="left"/>
                               </w:pPr>
                               <w:r>
-                                <w:t xml:space="preserve"> </w:t>
+                                <w:t xml:space="preserve"/>
                               </w:r>
                             </w:p>
                           </w:txbxContent>
@@ -1095,7 +1095,7 @@
                                 <w:jc w:val="left"/>
                               </w:pPr>
                               <w:r>
-                                <w:t xml:space="preserve"> </w:t>
+                                <w:t xml:space="preserve"/>
                               </w:r>
                             </w:p>
                           </w:txbxContent>
@@ -1133,7 +1133,7 @@
                                   <w:b/>
                                   <w:sz w:val="32"/>
                                 </w:rPr>
-                                <w:t>{{CUSTOMER_NAME}}</w:t>
+                                <w:t/>
                               </w:r>
                             </w:p>
                           </w:txbxContent>
@@ -1171,7 +1171,7 @@
                                   <w:b/>
                                   <w:sz w:val="32"/>
                                 </w:rPr>
-                                <w:t xml:space="preserve"> </w:t>
+                                <w:t xml:space="preserve"/>
                               </w:r>
                             </w:p>
                           </w:txbxContent>
@@ -1204,7 +1204,7 @@
                                 <w:jc w:val="left"/>
                               </w:pPr>
                               <w:r>
-                                <w:t xml:space="preserve"> </w:t>
+                                <w:t xml:space="preserve"/>
                               </w:r>
                             </w:p>
                           </w:txbxContent>
@@ -1241,7 +1241,7 @@
                                   <w:rFonts w:ascii="Georgia" w:eastAsia="Georgia" w:hAnsi="Georgia" w:cs="Georgia"/>
                                   <w:sz w:val="22"/>
                                 </w:rPr>
-                                <w:t>(</w:t>
+                                <w:t/>
                               </w:r>
                             </w:p>
                           </w:txbxContent>
@@ -1278,7 +1278,7 @@
                                   <w:rFonts w:ascii="Georgia" w:eastAsia="Georgia" w:hAnsi="Georgia" w:cs="Georgia"/>
                                   <w:sz w:val="22"/>
                                 </w:rPr>
-                                <w:t>The PURCHASER</w:t>
+                                <w:t/>
                               </w:r>
                             </w:p>
                           </w:txbxContent>
@@ -1315,7 +1315,7 @@
                                   <w:rFonts w:ascii="Georgia" w:eastAsia="Georgia" w:hAnsi="Georgia" w:cs="Georgia"/>
                                   <w:sz w:val="22"/>
                                 </w:rPr>
-                                <w:t>)</w:t>
+                                <w:t/>
                               </w:r>
                             </w:p>
                           </w:txbxContent>
@@ -1352,7 +1352,7 @@
                                   <w:rFonts w:ascii="Georgia" w:eastAsia="Georgia" w:hAnsi="Georgia" w:cs="Georgia"/>
                                   <w:sz w:val="22"/>
                                 </w:rPr>
-                                <w:t xml:space="preserve"> </w:t>
+                                <w:t xml:space="preserve"/>
                               </w:r>
                             </w:p>
                           </w:txbxContent>
@@ -1385,7 +1385,7 @@
                                 <w:jc w:val="left"/>
                               </w:pPr>
                               <w:r>
-                                <w:t xml:space="preserve"> </w:t>
+                                <w:t xml:space="preserve"/>
                               </w:r>
                             </w:p>
                           </w:txbxContent>
@@ -1418,7 +1418,7 @@
                                 <w:jc w:val="left"/>
                               </w:pPr>
                               <w:r>
-                                <w:t xml:space="preserve"> </w:t>
+                                <w:t xml:space="preserve"/>
                               </w:r>
                             </w:p>
                           </w:txbxContent>
@@ -1451,7 +1451,7 @@
                                 <w:jc w:val="left"/>
                               </w:pPr>
                               <w:r>
-                                <w:t xml:space="preserve"> </w:t>
+                                <w:t xml:space="preserve"/>
                               </w:r>
                             </w:p>
                           </w:txbxContent>
@@ -1484,7 +1484,7 @@
                                 <w:jc w:val="left"/>
                               </w:pPr>
                               <w:r>
-                                <w:t xml:space="preserve"> </w:t>
+                                <w:t xml:space="preserve"/>
                               </w:r>
                             </w:p>
                           </w:txbxContent>
@@ -1517,7 +1517,7 @@
                                 <w:jc w:val="left"/>
                               </w:pPr>
                               <w:r>
-                                <w:t xml:space="preserve"> </w:t>
+                                <w:t xml:space="preserve"/>
                               </w:r>
                             </w:p>
                           </w:txbxContent>
@@ -1555,7 +1555,7 @@
                                   <w:b/>
                                   <w:sz w:val="32"/>
                                 </w:rPr>
-                                <w:t xml:space="preserve">IN RESPECT OF </w:t>
+                                <w:t xml:space="preserve"/>
                               </w:r>
                             </w:p>
                           </w:txbxContent>
@@ -1593,7 +1593,7 @@
                                   <w:b/>
                                   <w:sz w:val="32"/>
                                 </w:rPr>
-                                <w:t>TWO</w:t>
+                                <w:t/>
                               </w:r>
                             </w:p>
                           </w:txbxContent>
@@ -1631,7 +1631,7 @@
                                   <w:b/>
                                   <w:sz w:val="32"/>
                                 </w:rPr>
-                                <w:t xml:space="preserve"> </w:t>
+                                <w:t xml:space="preserve"/>
                               </w:r>
                             </w:p>
                           </w:txbxContent>
@@ -1669,7 +1669,7 @@
                                   <w:b/>
                                   <w:sz w:val="32"/>
                                 </w:rPr>
-                                <w:t>(</w:t>
+                                <w:t/>
                               </w:r>
                             </w:p>
                           </w:txbxContent>
@@ -1707,7 +1707,7 @@
                                   <w:b/>
                                   <w:sz w:val="32"/>
                                 </w:rPr>
-                                <w:t>2</w:t>
+                                <w:t/>
                               </w:r>
                             </w:p>
                           </w:txbxContent>
@@ -1745,7 +1745,7 @@
                                   <w:b/>
                                   <w:sz w:val="32"/>
                                 </w:rPr>
-                                <w:t>)</w:t>
+                                <w:t/>
                               </w:r>
                             </w:p>
                           </w:txbxContent>
@@ -1783,7 +1783,7 @@
                                   <w:b/>
                                   <w:sz w:val="32"/>
                                 </w:rPr>
-                                <w:t xml:space="preserve"> PLOT</w:t>
+                                <w:t xml:space="preserve"/>
                               </w:r>
                             </w:p>
                           </w:txbxContent>
@@ -1821,7 +1821,7 @@
                                   <w:b/>
                                   <w:sz w:val="32"/>
                                 </w:rPr>
-                                <w:t>S</w:t>
+                                <w:t/>
                               </w:r>
                             </w:p>
                           </w:txbxContent>
@@ -1859,7 +1859,7 @@
                                   <w:b/>
                                   <w:sz w:val="32"/>
                                 </w:rPr>
-                                <w:t xml:space="preserve"> </w:t>
+                                <w:t xml:space="preserve"/>
                               </w:r>
                             </w:p>
                           </w:txbxContent>
@@ -1897,7 +1897,7 @@
                                   <w:b/>
                                   <w:sz w:val="32"/>
                                 </w:rPr>
-                                <w:t xml:space="preserve">OF LAND </w:t>
+                                <w:t xml:space="preserve"/>
                               </w:r>
                             </w:p>
                           </w:txbxContent>
@@ -1935,7 +1935,7 @@
                                   <w:b/>
                                   <w:sz w:val="32"/>
                                 </w:rPr>
-                                <w:t xml:space="preserve">MEASURING </w:t>
+                                <w:t xml:space="preserve"/>
                               </w:r>
                             </w:p>
                           </w:txbxContent>
@@ -1973,7 +1973,7 @@
                                   <w:b/>
                                   <w:sz w:val="32"/>
                                 </w:rPr>
-                                <w:t>900</w:t>
+                                <w:t/>
                               </w:r>
                             </w:p>
                           </w:txbxContent>
@@ -2011,7 +2011,7 @@
                                   <w:b/>
                                   <w:sz w:val="32"/>
                                 </w:rPr>
-                                <w:t xml:space="preserve"> </w:t>
+                                <w:t xml:space="preserve"/>
                               </w:r>
                             </w:p>
                           </w:txbxContent>
@@ -2049,7 +2049,7 @@
                                   <w:b/>
                                   <w:sz w:val="32"/>
                                 </w:rPr>
-                                <w:t xml:space="preserve">SQUARE METERS SITUATE AT </w:t>
+                                <w:t xml:space="preserve"/>
                               </w:r>
                             </w:p>
                           </w:txbxContent>
@@ -2087,7 +2087,7 @@
                                   <w:b/>
                                   <w:sz w:val="32"/>
                                 </w:rPr>
-                                <w:t>ALAFIA GARDENS, LOCATE</w:t>
+                                <w:t/>
                               </w:r>
                             </w:p>
                           </w:txbxContent>
@@ -2125,7 +2125,7 @@
                                   <w:b/>
                                   <w:sz w:val="32"/>
                                 </w:rPr>
-                                <w:t xml:space="preserve">D AT WARA </w:t>
+                                <w:t xml:space="preserve"/>
                               </w:r>
                             </w:p>
                           </w:txbxContent>
@@ -2163,7 +2163,7 @@
                                   <w:b/>
                                   <w:sz w:val="32"/>
                                 </w:rPr>
-                                <w:t xml:space="preserve">COMMUNITY, </w:t>
+                                <w:t xml:space="preserve"/>
                               </w:r>
                             </w:p>
                           </w:txbxContent>
@@ -2201,7 +2201,7 @@
                                   <w:b/>
                                   <w:sz w:val="32"/>
                                 </w:rPr>
-                                <w:t>ALO</w:t>
+                                <w:t/>
                               </w:r>
                             </w:p>
                           </w:txbxContent>
@@ -2239,7 +2239,7 @@
                                   <w:b/>
                                   <w:sz w:val="32"/>
                                 </w:rPr>
-                                <w:t>NG E</w:t>
+                                <w:t/>
                               </w:r>
                             </w:p>
                           </w:txbxContent>
@@ -2277,7 +2277,7 @@
                                   <w:b/>
                                   <w:sz w:val="32"/>
                                 </w:rPr>
-                                <w:t>I</w:t>
+                                <w:t/>
                               </w:r>
                             </w:p>
                           </w:txbxContent>
@@ -2315,7 +2315,7 @@
                                   <w:b/>
                                   <w:sz w:val="32"/>
                                 </w:rPr>
-                                <w:t>YENKORIN</w:t>
+                                <w:t/>
                               </w:r>
                             </w:p>
                           </w:txbxContent>
@@ -2353,7 +2353,7 @@
                                   <w:b/>
                                   <w:sz w:val="32"/>
                                 </w:rPr>
-                                <w:t xml:space="preserve"> </w:t>
+                                <w:t xml:space="preserve"/>
                               </w:r>
                             </w:p>
                           </w:txbxContent>
@@ -2391,7 +2391,7 @@
                                   <w:b/>
                                   <w:sz w:val="32"/>
                                 </w:rPr>
-                                <w:t>E</w:t>
+                                <w:t/>
                               </w:r>
                             </w:p>
                           </w:txbxContent>
@@ -2429,7 +2429,7 @@
                                   <w:b/>
                                   <w:sz w:val="32"/>
                                 </w:rPr>
-                                <w:t>XPR</w:t>
+                                <w:t/>
                               </w:r>
                             </w:p>
                           </w:txbxContent>
@@ -2467,7 +2467,7 @@
                                   <w:b/>
                                   <w:sz w:val="32"/>
                                 </w:rPr>
-                                <w:t>ESS</w:t>
+                                <w:t/>
                               </w:r>
                             </w:p>
                           </w:txbxContent>
@@ -2505,7 +2505,7 @@
                                   <w:b/>
                                   <w:sz w:val="32"/>
                                 </w:rPr>
-                                <w:t xml:space="preserve"> </w:t>
+                                <w:t xml:space="preserve"/>
                               </w:r>
                             </w:p>
                           </w:txbxContent>
@@ -2543,7 +2543,7 @@
                                   <w:b/>
                                   <w:sz w:val="32"/>
                                 </w:rPr>
-                                <w:t>R</w:t>
+                                <w:t/>
                               </w:r>
                             </w:p>
                           </w:txbxContent>
@@ -2581,7 +2581,7 @@
                                   <w:b/>
                                   <w:sz w:val="32"/>
                                 </w:rPr>
-                                <w:t xml:space="preserve">OAD </w:t>
+                                <w:t xml:space="preserve"/>
                               </w:r>
                             </w:p>
                           </w:txbxContent>
@@ -2619,7 +2619,7 @@
                                   <w:b/>
                                   <w:sz w:val="32"/>
                                 </w:rPr>
-                                <w:t>KWARA STATE.</w:t>
+                                <w:t/>
                               </w:r>
                             </w:p>
                           </w:txbxContent>
@@ -2657,7 +2657,7 @@
                                   <w:b/>
                                   <w:sz w:val="32"/>
                                 </w:rPr>
-                                <w:t xml:space="preserve"> </w:t>
+                                <w:t xml:space="preserve"/>
                               </w:r>
                             </w:p>
                           </w:txbxContent>
@@ -2690,7 +2690,7 @@
                                 <w:jc w:val="left"/>
                               </w:pPr>
                               <w:r>
-                                <w:t xml:space="preserve"> </w:t>
+                                <w:t xml:space="preserve"/>
                               </w:r>
                             </w:p>
                           </w:txbxContent>
@@ -2727,7 +2727,7 @@
                                   <w:rFonts w:ascii="Georgia" w:eastAsia="Georgia" w:hAnsi="Georgia" w:cs="Georgia"/>
                                   <w:sz w:val="32"/>
                                 </w:rPr>
-                                <w:t>...............................................................................................</w:t>
+                                <w:t/>
                               </w:r>
                             </w:p>
                           </w:txbxContent>
@@ -2764,7 +2764,7 @@
                                   <w:rFonts w:ascii="Georgia" w:eastAsia="Georgia" w:hAnsi="Georgia" w:cs="Georgia"/>
                                   <w:sz w:val="32"/>
                                 </w:rPr>
-                                <w:t xml:space="preserve"> </w:t>
+                                <w:t xml:space="preserve"/>
                               </w:r>
                             </w:p>
                           </w:txbxContent>
@@ -2797,7 +2797,7 @@
                                 <w:jc w:val="left"/>
                               </w:pPr>
                               <w:r>
-                                <w:t xml:space="preserve"> </w:t>
+                                <w:t xml:space="preserve"/>
                               </w:r>
                             </w:p>
                           </w:txbxContent>
@@ -2830,7 +2830,7 @@
                                 <w:jc w:val="left"/>
                               </w:pPr>
                               <w:r>
-                                <w:t xml:space="preserve"> </w:t>
+                                <w:t xml:space="preserve"/>
                               </w:r>
                             </w:p>
                           </w:txbxContent>
@@ -2863,7 +2863,7 @@
                                 <w:jc w:val="left"/>
                               </w:pPr>
                               <w:r>
-                                <w:t xml:space="preserve"> </w:t>
+                                <w:t xml:space="preserve"/>
                               </w:r>
                             </w:p>
                           </w:txbxContent>
@@ -2896,7 +2896,7 @@
                                 <w:jc w:val="left"/>
                               </w:pPr>
                               <w:r>
-                                <w:t xml:space="preserve"> </w:t>
+                                <w:t xml:space="preserve"/>
                               </w:r>
                             </w:p>
                           </w:txbxContent>
@@ -2929,7 +2929,7 @@
                                 <w:jc w:val="left"/>
                               </w:pPr>
                               <w:r>
-                                <w:t xml:space="preserve"> </w:t>
+                                <w:t xml:space="preserve"/>
                               </w:r>
                             </w:p>
                           </w:txbxContent>
@@ -2967,7 +2967,7 @@
                                   <w:b/>
                                   <w:sz w:val="18"/>
                                 </w:rPr>
-                                <w:t>PREPARED BY</w:t>
+                                <w:t/>
                               </w:r>
                             </w:p>
                           </w:txbxContent>
@@ -3005,7 +3005,7 @@
                                   <w:b/>
                                   <w:sz w:val="18"/>
                                 </w:rPr>
-                                <w:t xml:space="preserve"> </w:t>
+                                <w:t xml:space="preserve"/>
                               </w:r>
                             </w:p>
                           </w:txbxContent>
@@ -3038,7 +3038,7 @@
                                 <w:jc w:val="left"/>
                               </w:pPr>
                               <w:r>
-                                <w:t xml:space="preserve"> </w:t>
+                                <w:t xml:space="preserve"/>
                               </w:r>
                             </w:p>
                           </w:txbxContent>
@@ -3076,7 +3076,7 @@
                                   <w:b/>
                                   <w:sz w:val="18"/>
                                 </w:rPr>
-                                <w:t>D. O AROWOSAFE Esq.</w:t>
+                                <w:t/>
                               </w:r>
                             </w:p>
                           </w:txbxContent>
@@ -3114,7 +3114,7 @@
                                   <w:b/>
                                   <w:sz w:val="18"/>
                                 </w:rPr>
-                                <w:t xml:space="preserve"> </w:t>
+                                <w:t xml:space="preserve"/>
                               </w:r>
                             </w:p>
                           </w:txbxContent>
@@ -3147,7 +3147,7 @@
                                 <w:jc w:val="left"/>
                               </w:pPr>
                               <w:r>
-                                <w:t xml:space="preserve"> </w:t>
+                                <w:t xml:space="preserve"/>
                               </w:r>
                             </w:p>
                           </w:txbxContent>
@@ -3185,7 +3185,7 @@
                                   <w:b/>
                                   <w:sz w:val="18"/>
                                 </w:rPr>
-                                <w:t>FOR: LEGAL DEPARTMENT,</w:t>
+                                <w:t/>
                               </w:r>
                             </w:p>
                           </w:txbxContent>
@@ -3223,7 +3223,7 @@
                                   <w:b/>
                                   <w:sz w:val="18"/>
                                 </w:rPr>
-                                <w:t xml:space="preserve"> </w:t>
+                                <w:t xml:space="preserve"/>
                               </w:r>
                             </w:p>
                           </w:txbxContent>
@@ -3256,7 +3256,7 @@
                                 <w:jc w:val="left"/>
                               </w:pPr>
                               <w:r>
-                                <w:t xml:space="preserve"> </w:t>
+                                <w:t xml:space="preserve"/>
                               </w:r>
                             </w:p>
                           </w:txbxContent>
@@ -3294,7 +3294,7 @@
                                   <w:b/>
                                   <w:sz w:val="18"/>
                                 </w:rPr>
-                                <w:t>LANDCULTURE INVESTMENT LTD,</w:t>
+                                <w:t/>
                               </w:r>
                             </w:p>
                           </w:txbxContent>
@@ -3332,7 +3332,7 @@
                                   <w:b/>
                                   <w:sz w:val="18"/>
                                 </w:rPr>
-                                <w:t xml:space="preserve"> </w:t>
+                                <w:t xml:space="preserve"/>
                               </w:r>
                             </w:p>
                           </w:txbxContent>
@@ -3365,7 +3365,7 @@
                                 <w:jc w:val="left"/>
                               </w:pPr>
                               <w:r>
-                                <w:t xml:space="preserve"> </w:t>
+                                <w:t xml:space="preserve"/>
                               </w:r>
                             </w:p>
                           </w:txbxContent>
@@ -3403,7 +3403,7 @@
                                   <w:b/>
                                   <w:sz w:val="18"/>
                                 </w:rPr>
-                                <w:t>PLOT 6, OLD JEBBA ROAD, BES</w:t>
+                                <w:t/>
                               </w:r>
                             </w:p>
                           </w:txbxContent>
@@ -3441,7 +3441,7 @@
                                   <w:b/>
                                   <w:sz w:val="18"/>
                                 </w:rPr>
-                                <w:t>IDE IPMAN</w:t>
+                                <w:t/>
                               </w:r>
                             </w:p>
                           </w:txbxContent>
@@ -3479,7 +3479,7 @@
                                   <w:b/>
                                   <w:sz w:val="18"/>
                                 </w:rPr>
-                                <w:t xml:space="preserve"> </w:t>
+                                <w:t xml:space="preserve"/>
                               </w:r>
                             </w:p>
                           </w:txbxContent>
@@ -3517,7 +3517,7 @@
                                   <w:b/>
                                   <w:sz w:val="18"/>
                                 </w:rPr>
-                                <w:t>BUI</w:t>
+                                <w:t/>
                               </w:r>
                             </w:p>
                           </w:txbxContent>
@@ -3555,7 +3555,7 @@
                                   <w:b/>
                                   <w:sz w:val="18"/>
                                 </w:rPr>
-                                <w:t>LD</w:t>
+                                <w:t/>
                               </w:r>
                             </w:p>
                           </w:txbxContent>
@@ -3593,7 +3593,7 @@
                                   <w:b/>
                                   <w:sz w:val="18"/>
                                 </w:rPr>
-                                <w:t>ING</w:t>
+                                <w:t/>
                               </w:r>
                             </w:p>
                           </w:txbxContent>
@@ -3631,7 +3631,7 @@
                                   <w:b/>
                                   <w:sz w:val="18"/>
                                 </w:rPr>
-                                <w:t>,</w:t>
+                                <w:t/>
                               </w:r>
                             </w:p>
                           </w:txbxContent>
@@ -3669,7 +3669,7 @@
                                   <w:b/>
                                   <w:sz w:val="18"/>
                                 </w:rPr>
-                                <w:t xml:space="preserve"> </w:t>
+                                <w:t xml:space="preserve"/>
                               </w:r>
                             </w:p>
                           </w:txbxContent>
@@ -3702,7 +3702,7 @@
                                 <w:jc w:val="left"/>
                               </w:pPr>
                               <w:r>
-                                <w:t xml:space="preserve"> </w:t>
+                                <w:t xml:space="preserve"/>
                               </w:r>
                             </w:p>
                           </w:txbxContent>
@@ -3740,7 +3740,7 @@
                                   <w:b/>
                                   <w:sz w:val="18"/>
                                 </w:rPr>
-                                <w:t>S</w:t>
+                                <w:t/>
                               </w:r>
                             </w:p>
                           </w:txbxContent>
@@ -3778,7 +3778,7 @@
                                   <w:b/>
                                   <w:sz w:val="18"/>
                                 </w:rPr>
-                                <w:t>A</w:t>
+                                <w:t/>
                               </w:r>
                             </w:p>
                           </w:txbxContent>
@@ -3816,7 +3816,7 @@
                                   <w:b/>
                                   <w:sz w:val="18"/>
                                 </w:rPr>
-                                <w:t>NGO, ILORIN, KWARA STATE.</w:t>
+                                <w:t/>
                               </w:r>
                             </w:p>
                           </w:txbxContent>
@@ -3854,7 +3854,7 @@
                                   <w:b/>
                                   <w:sz w:val="18"/>
                                 </w:rPr>
-                                <w:t xml:space="preserve"> </w:t>
+                                <w:t xml:space="preserve"/>
                               </w:r>
                             </w:p>
                           </w:txbxContent>
@@ -3909,7 +3909,7 @@
                             <w:b/>
                             <w:sz w:val="44"/>
                           </w:rPr>
-                          <w:t xml:space="preserve"> </w:t>
+                          <w:t xml:space="preserve"/>
                         </w:r>
                       </w:p>
                     </w:txbxContent>
@@ -3930,7 +3930,7 @@
                             <w:b/>
                             <w:sz w:val="44"/>
                           </w:rPr>
-                          <w:t>CONTRACT OF SALE</w:t>
+                          <w:t/>
                         </w:r>
                       </w:p>
                     </w:txbxContent>
@@ -3951,7 +3951,7 @@
                             <w:b/>
                             <w:sz w:val="44"/>
                           </w:rPr>
-                          <w:t xml:space="preserve"> </w:t>
+                          <w:t xml:space="preserve"/>
                         </w:r>
                       </w:p>
                     </w:txbxContent>
@@ -3967,7 +3967,7 @@
                           <w:jc w:val="left"/>
                         </w:pPr>
                         <w:r>
-                          <w:t xml:space="preserve"> </w:t>
+                          <w:t xml:space="preserve"/>
                         </w:r>
                       </w:p>
                     </w:txbxContent>
@@ -3983,7 +3983,7 @@
                           <w:jc w:val="left"/>
                         </w:pPr>
                         <w:r>
-                          <w:t xml:space="preserve"> </w:t>
+                          <w:t xml:space="preserve"/>
                         </w:r>
                       </w:p>
                     </w:txbxContent>
@@ -3999,7 +3999,7 @@
                           <w:jc w:val="left"/>
                         </w:pPr>
                         <w:r>
-                          <w:t xml:space="preserve"> </w:t>
+                          <w:t xml:space="preserve"/>
                         </w:r>
                       </w:p>
                     </w:txbxContent>
@@ -4015,7 +4015,7 @@
                           <w:jc w:val="left"/>
                         </w:pPr>
                         <w:r>
-                          <w:t xml:space="preserve"> </w:t>
+                          <w:t xml:space="preserve"/>
                         </w:r>
                       </w:p>
                     </w:txbxContent>
@@ -4035,7 +4035,7 @@
                             <w:rFonts w:ascii="Georgia" w:eastAsia="Georgia" w:hAnsi="Georgia" w:cs="Georgia"/>
                             <w:b/>
                           </w:rPr>
-                          <w:t>BETWEEN</w:t>
+                          <w:t/>
                         </w:r>
                       </w:p>
                     </w:txbxContent>
@@ -4055,7 +4055,7 @@
                             <w:rFonts w:ascii="Georgia" w:eastAsia="Georgia" w:hAnsi="Georgia" w:cs="Georgia"/>
                             <w:b/>
                           </w:rPr>
-                          <w:t xml:space="preserve"> </w:t>
+                          <w:t xml:space="preserve"/>
                         </w:r>
                       </w:p>
                     </w:txbxContent>
@@ -4071,7 +4071,7 @@
                           <w:jc w:val="left"/>
                         </w:pPr>
                         <w:r>
-                          <w:t xml:space="preserve"> </w:t>
+                          <w:t xml:space="preserve"/>
                         </w:r>
                       </w:p>
                     </w:txbxContent>
@@ -4087,7 +4087,7 @@
                           <w:jc w:val="left"/>
                         </w:pPr>
                         <w:r>
-                          <w:t xml:space="preserve"> </w:t>
+                          <w:t xml:space="preserve"/>
                         </w:r>
                       </w:p>
                     </w:txbxContent>
@@ -4103,7 +4103,7 @@
                           <w:jc w:val="left"/>
                         </w:pPr>
                         <w:r>
-                          <w:t xml:space="preserve"> </w:t>
+                          <w:t xml:space="preserve"/>
                         </w:r>
                       </w:p>
                     </w:txbxContent>
@@ -4119,7 +4119,7 @@
                           <w:jc w:val="left"/>
                         </w:pPr>
                         <w:r>
-                          <w:t xml:space="preserve"> </w:t>
+                          <w:t xml:space="preserve"/>
                         </w:r>
                       </w:p>
                     </w:txbxContent>
@@ -4140,7 +4140,7 @@
                             <w:b/>
                             <w:sz w:val="32"/>
                           </w:rPr>
-                          <w:t>LANDCULTURE INVESTMENT LTD</w:t>
+                          <w:t/>
                         </w:r>
                       </w:p>
                     </w:txbxContent>
@@ -4161,7 +4161,7 @@
                             <w:b/>
                             <w:sz w:val="32"/>
                           </w:rPr>
-                          <w:t xml:space="preserve"> </w:t>
+                          <w:t xml:space="preserve"/>
                         </w:r>
                       </w:p>
                     </w:txbxContent>
@@ -4177,7 +4177,7 @@
                           <w:jc w:val="left"/>
                         </w:pPr>
                         <w:r>
-                          <w:t xml:space="preserve"> </w:t>
+                          <w:t xml:space="preserve"/>
                         </w:r>
                       </w:p>
                     </w:txbxContent>
@@ -4197,7 +4197,7 @@
                             <w:rFonts w:ascii="Georgia" w:eastAsia="Georgia" w:hAnsi="Georgia" w:cs="Georgia"/>
                             <w:sz w:val="22"/>
                           </w:rPr>
-                          <w:t>The VENDOR</w:t>
+                          <w:t/>
                         </w:r>
                       </w:p>
                     </w:txbxContent>
@@ -4217,7 +4217,7 @@
                             <w:rFonts w:ascii="Georgia" w:eastAsia="Georgia" w:hAnsi="Georgia" w:cs="Georgia"/>
                             <w:sz w:val="22"/>
                           </w:rPr>
-                          <w:t>)</w:t>
+                          <w:t/>
                         </w:r>
                       </w:p>
                     </w:txbxContent>
@@ -4237,7 +4237,7 @@
                             <w:rFonts w:ascii="Georgia" w:eastAsia="Georgia" w:hAnsi="Georgia" w:cs="Georgia"/>
                             <w:sz w:val="22"/>
                           </w:rPr>
-                          <w:t>(</w:t>
+                          <w:t/>
                         </w:r>
                       </w:p>
                     </w:txbxContent>
@@ -4257,7 +4257,7 @@
                             <w:rFonts w:ascii="Georgia" w:eastAsia="Georgia" w:hAnsi="Georgia" w:cs="Georgia"/>
                             <w:sz w:val="22"/>
                           </w:rPr>
-                          <w:t xml:space="preserve"> </w:t>
+                          <w:t xml:space="preserve"/>
                         </w:r>
                       </w:p>
                     </w:txbxContent>
@@ -4273,7 +4273,7 @@
                           <w:jc w:val="left"/>
                         </w:pPr>
                         <w:r>
-                          <w:t xml:space="preserve"> </w:t>
+                          <w:t xml:space="preserve"/>
                         </w:r>
                       </w:p>
                     </w:txbxContent>
@@ -4289,7 +4289,7 @@
                           <w:jc w:val="left"/>
                         </w:pPr>
                         <w:r>
-                          <w:t xml:space="preserve"> </w:t>
+                          <w:t xml:space="preserve"/>
                         </w:r>
                       </w:p>
                     </w:txbxContent>
@@ -4305,7 +4305,7 @@
                           <w:jc w:val="left"/>
                         </w:pPr>
                         <w:r>
-                          <w:t xml:space="preserve"> </w:t>
+                          <w:t xml:space="preserve"/>
                         </w:r>
                       </w:p>
                     </w:txbxContent>
@@ -4321,7 +4321,7 @@
                           <w:jc w:val="left"/>
                         </w:pPr>
                         <w:r>
-                          <w:t xml:space="preserve"> </w:t>
+                          <w:t xml:space="preserve"/>
                         </w:r>
                       </w:p>
                     </w:txbxContent>
@@ -4342,7 +4342,7 @@
                             <w:b/>
                             <w:sz w:val="20"/>
                           </w:rPr>
-                          <w:t>AND</w:t>
+                          <w:t/>
                         </w:r>
                       </w:p>
                     </w:txbxContent>
@@ -4363,7 +4363,7 @@
                             <w:b/>
                             <w:sz w:val="20"/>
                           </w:rPr>
-                          <w:t xml:space="preserve"> </w:t>
+                          <w:t xml:space="preserve"/>
                         </w:r>
                       </w:p>
                     </w:txbxContent>
@@ -4379,7 +4379,7 @@
                           <w:jc w:val="left"/>
                         </w:pPr>
                         <w:r>
-                          <w:t xml:space="preserve"> </w:t>
+                          <w:t xml:space="preserve"/>
                         </w:r>
                       </w:p>
                     </w:txbxContent>
@@ -4395,7 +4395,7 @@
                           <w:jc w:val="left"/>
                         </w:pPr>
                         <w:r>
-                          <w:t xml:space="preserve"> </w:t>
+                          <w:t xml:space="preserve"/>
                         </w:r>
                       </w:p>
                     </w:txbxContent>
@@ -4411,7 +4411,7 @@
                           <w:jc w:val="left"/>
                         </w:pPr>
                         <w:r>
-                          <w:t xml:space="preserve"> </w:t>
+                          <w:t xml:space="preserve"/>
                         </w:r>
                       </w:p>
                     </w:txbxContent>
@@ -4427,7 +4427,7 @@
                           <w:jc w:val="left"/>
                         </w:pPr>
                         <w:r>
-                          <w:t xml:space="preserve"> </w:t>
+                          <w:t xml:space="preserve"/>
                         </w:r>
                       </w:p>
                     </w:txbxContent>
@@ -4448,7 +4448,7 @@
                             <w:b/>
                             <w:sz w:val="32"/>
                           </w:rPr>
-                          <w:t>{{CUSTOMER_NAME}}</w:t>
+                          <w:t/>
                         </w:r>
                       </w:p>
                     </w:txbxContent>
@@ -4469,7 +4469,7 @@
                             <w:b/>
                             <w:sz w:val="32"/>
                           </w:rPr>
-                          <w:t xml:space="preserve"> </w:t>
+                          <w:t xml:space="preserve"/>
                         </w:r>
                       </w:p>
                     </w:txbxContent>
@@ -4485,7 +4485,7 @@
                           <w:jc w:val="left"/>
                         </w:pPr>
                         <w:r>
-                          <w:t xml:space="preserve"> </w:t>
+                          <w:t xml:space="preserve"/>
                         </w:r>
                       </w:p>
                     </w:txbxContent>
@@ -4505,7 +4505,7 @@
                             <w:rFonts w:ascii="Georgia" w:eastAsia="Georgia" w:hAnsi="Georgia" w:cs="Georgia"/>
                             <w:sz w:val="22"/>
                           </w:rPr>
-                          <w:t>(</w:t>
+                          <w:t/>
                         </w:r>
                       </w:p>
                     </w:txbxContent>
@@ -4525,7 +4525,7 @@
                             <w:rFonts w:ascii="Georgia" w:eastAsia="Georgia" w:hAnsi="Georgia" w:cs="Georgia"/>
                             <w:sz w:val="22"/>
                           </w:rPr>
-                          <w:t>The PURCHASER</w:t>
+                          <w:t/>
                         </w:r>
                       </w:p>
                     </w:txbxContent>
@@ -4545,7 +4545,7 @@
                             <w:rFonts w:ascii="Georgia" w:eastAsia="Georgia" w:hAnsi="Georgia" w:cs="Georgia"/>
                             <w:sz w:val="22"/>
                           </w:rPr>
-                          <w:t>)</w:t>
+                          <w:t/>
                         </w:r>
                       </w:p>
                     </w:txbxContent>
@@ -4565,7 +4565,7 @@
                             <w:rFonts w:ascii="Georgia" w:eastAsia="Georgia" w:hAnsi="Georgia" w:cs="Georgia"/>
                             <w:sz w:val="22"/>
                           </w:rPr>
-                          <w:t xml:space="preserve"> </w:t>
+                          <w:t xml:space="preserve"/>
                         </w:r>
                       </w:p>
                     </w:txbxContent>
@@ -4581,7 +4581,7 @@
                           <w:jc w:val="left"/>
                         </w:pPr>
                         <w:r>
-                          <w:t xml:space="preserve"> </w:t>
+                          <w:t xml:space="preserve"/>
                         </w:r>
                       </w:p>
                     </w:txbxContent>
@@ -4597,7 +4597,7 @@
                           <w:jc w:val="left"/>
                         </w:pPr>
                         <w:r>
-                          <w:t xml:space="preserve"> </w:t>
+                          <w:t xml:space="preserve"/>
                         </w:r>
                       </w:p>
                     </w:txbxContent>
@@ -4613,7 +4613,7 @@
                           <w:jc w:val="left"/>
                         </w:pPr>
                         <w:r>
-                          <w:t xml:space="preserve"> </w:t>
+                          <w:t xml:space="preserve"/>
                         </w:r>
                       </w:p>
                     </w:txbxContent>
@@ -4629,7 +4629,7 @@
                           <w:jc w:val="left"/>
                         </w:pPr>
                         <w:r>
-                          <w:t xml:space="preserve"> </w:t>
+                          <w:t xml:space="preserve"/>
                         </w:r>
                       </w:p>
                     </w:txbxContent>
@@ -4645,7 +4645,7 @@
                           <w:jc w:val="left"/>
                         </w:pPr>
                         <w:r>
-                          <w:t xml:space="preserve"> </w:t>
+                          <w:t xml:space="preserve"/>
                         </w:r>
                       </w:p>
                     </w:txbxContent>
@@ -4666,7 +4666,7 @@
                             <w:b/>
                             <w:sz w:val="32"/>
                           </w:rPr>
-                          <w:t xml:space="preserve">IN RESPECT OF </w:t>
+                          <w:t xml:space="preserve"/>
                         </w:r>
                       </w:p>
                     </w:txbxContent>
@@ -4687,7 +4687,7 @@
                             <w:b/>
                             <w:sz w:val="32"/>
                           </w:rPr>
-                          <w:t>TWO</w:t>
+                          <w:t/>
                         </w:r>
                       </w:p>
                     </w:txbxContent>
@@ -4708,7 +4708,7 @@
                             <w:b/>
                             <w:sz w:val="32"/>
                           </w:rPr>
-                          <w:t xml:space="preserve"> </w:t>
+                          <w:t xml:space="preserve"/>
                         </w:r>
                       </w:p>
                     </w:txbxContent>
@@ -4729,7 +4729,7 @@
                             <w:b/>
                             <w:sz w:val="32"/>
                           </w:rPr>
-                          <w:t>(</w:t>
+                          <w:t/>
                         </w:r>
                       </w:p>
                     </w:txbxContent>
@@ -4750,7 +4750,7 @@
                             <w:b/>
                             <w:sz w:val="32"/>
                           </w:rPr>
-                          <w:t>2</w:t>
+                          <w:t/>
                         </w:r>
                       </w:p>
                     </w:txbxContent>
@@ -4771,7 +4771,7 @@
                             <w:b/>
                             <w:sz w:val="32"/>
                           </w:rPr>
-                          <w:t>)</w:t>
+                          <w:t/>
                         </w:r>
                       </w:p>
                     </w:txbxContent>
@@ -4792,7 +4792,7 @@
                             <w:b/>
                             <w:sz w:val="32"/>
                           </w:rPr>
-                          <w:t xml:space="preserve"> PLOT</w:t>
+                          <w:t xml:space="preserve"/>
                         </w:r>
                       </w:p>
                     </w:txbxContent>
@@ -4813,7 +4813,7 @@
                             <w:b/>
                             <w:sz w:val="32"/>
                           </w:rPr>
-                          <w:t>S</w:t>
+                          <w:t/>
                         </w:r>
                       </w:p>
                     </w:txbxContent>
@@ -4834,7 +4834,7 @@
                             <w:b/>
                             <w:sz w:val="32"/>
                           </w:rPr>
-                          <w:t xml:space="preserve"> </w:t>
+                          <w:t xml:space="preserve"/>
                         </w:r>
                       </w:p>
                     </w:txbxContent>
@@ -4855,7 +4855,7 @@
                             <w:b/>
                             <w:sz w:val="32"/>
                           </w:rPr>
-                          <w:t xml:space="preserve">OF LAND </w:t>
+                          <w:t xml:space="preserve"/>
                         </w:r>
                       </w:p>
                     </w:txbxContent>
@@ -4876,7 +4876,7 @@
                             <w:b/>
                             <w:sz w:val="32"/>
                           </w:rPr>
-                          <w:t xml:space="preserve">MEASURING </w:t>
+                          <w:t xml:space="preserve"/>
                         </w:r>
                       </w:p>
                     </w:txbxContent>
@@ -4897,7 +4897,7 @@
                             <w:b/>
                             <w:sz w:val="32"/>
                           </w:rPr>
-                          <w:t>900</w:t>
+                          <w:t/>
                         </w:r>
                       </w:p>
                     </w:txbxContent>
@@ -4918,7 +4918,7 @@
                             <w:b/>
                             <w:sz w:val="32"/>
                           </w:rPr>
-                          <w:t xml:space="preserve"> </w:t>
+                          <w:t xml:space="preserve"/>
                         </w:r>
                       </w:p>
                     </w:txbxContent>
@@ -4939,7 +4939,7 @@
                             <w:b/>
                             <w:sz w:val="32"/>
                           </w:rPr>
-                          <w:t xml:space="preserve">SQUARE METERS SITUATE AT </w:t>
+                          <w:t xml:space="preserve"/>
                         </w:r>
                       </w:p>
                     </w:txbxContent>
@@ -4960,7 +4960,7 @@
                             <w:b/>
                             <w:sz w:val="32"/>
                           </w:rPr>
-                          <w:t>ALAFIA GARDENS, LOCATE</w:t>
+                          <w:t/>
                         </w:r>
                       </w:p>
                     </w:txbxContent>
@@ -4981,7 +4981,7 @@
                             <w:b/>
                             <w:sz w:val="32"/>
                           </w:rPr>
-                          <w:t xml:space="preserve">D AT WARA </w:t>
+                          <w:t xml:space="preserve"/>
                         </w:r>
                       </w:p>
                     </w:txbxContent>
@@ -5002,7 +5002,7 @@
                             <w:b/>
                             <w:sz w:val="32"/>
                           </w:rPr>
-                          <w:t xml:space="preserve">COMMUNITY, </w:t>
+                          <w:t xml:space="preserve"/>
                         </w:r>
                       </w:p>
                     </w:txbxContent>
@@ -5023,7 +5023,7 @@
                             <w:b/>
                             <w:sz w:val="32"/>
                           </w:rPr>
-                          <w:t>ALO</w:t>
+                          <w:t/>
                         </w:r>
                       </w:p>
                     </w:txbxContent>
@@ -5044,7 +5044,7 @@
                             <w:b/>
                             <w:sz w:val="32"/>
                           </w:rPr>
-                          <w:t>NG E</w:t>
+                          <w:t/>
                         </w:r>
                       </w:p>
                     </w:txbxContent>
@@ -5065,7 +5065,7 @@
                             <w:b/>
                             <w:sz w:val="32"/>
                           </w:rPr>
-                          <w:t>I</w:t>
+                          <w:t/>
                         </w:r>
                       </w:p>
                     </w:txbxContent>
@@ -5086,7 +5086,7 @@
                             <w:b/>
                             <w:sz w:val="32"/>
                           </w:rPr>
-                          <w:t>YENKORIN</w:t>
+                          <w:t/>
                         </w:r>
                       </w:p>
                     </w:txbxContent>
@@ -5107,7 +5107,7 @@
                             <w:b/>
                             <w:sz w:val="32"/>
                           </w:rPr>
-                          <w:t xml:space="preserve"> </w:t>
+                          <w:t xml:space="preserve"/>
                         </w:r>
                       </w:p>
                     </w:txbxContent>
@@ -5128,7 +5128,7 @@
                             <w:b/>
                             <w:sz w:val="32"/>
                           </w:rPr>
-                          <w:t>E</w:t>
+                          <w:t/>
                         </w:r>
                       </w:p>
                     </w:txbxContent>
@@ -5149,7 +5149,7 @@
                             <w:b/>
                             <w:sz w:val="32"/>
                           </w:rPr>
-                          <w:t>XPR</w:t>
+                          <w:t/>
                         </w:r>
                       </w:p>
                     </w:txbxContent>
@@ -5170,7 +5170,7 @@
                             <w:b/>
                             <w:sz w:val="32"/>
                           </w:rPr>
-                          <w:t>ESS</w:t>
+                          <w:t/>
                         </w:r>
                       </w:p>
                     </w:txbxContent>
@@ -5191,7 +5191,7 @@
                             <w:b/>
                             <w:sz w:val="32"/>
                           </w:rPr>
-                          <w:t xml:space="preserve"> </w:t>
+                          <w:t xml:space="preserve"/>
                         </w:r>
                       </w:p>
                     </w:txbxContent>
@@ -5212,7 +5212,7 @@
                             <w:b/>
                             <w:sz w:val="32"/>
                           </w:rPr>
-                          <w:t>R</w:t>
+                          <w:t/>
                         </w:r>
                       </w:p>
                     </w:txbxContent>
@@ -5233,7 +5233,7 @@
                             <w:b/>
                             <w:sz w:val="32"/>
                           </w:rPr>
-                          <w:t xml:space="preserve">OAD </w:t>
+                          <w:t xml:space="preserve"/>
                         </w:r>
                       </w:p>
                     </w:txbxContent>
@@ -5254,7 +5254,7 @@
                             <w:b/>
                             <w:sz w:val="32"/>
                           </w:rPr>
-                          <w:t>KWARA STATE.</w:t>
+                          <w:t/>
                         </w:r>
                       </w:p>
                     </w:txbxContent>
@@ -5275,7 +5275,7 @@
                             <w:b/>
                             <w:sz w:val="32"/>
                           </w:rPr>
-                          <w:t xml:space="preserve"> </w:t>
+                          <w:t xml:space="preserve"/>
                         </w:r>
                       </w:p>
                     </w:txbxContent>
@@ -5291,7 +5291,7 @@
                           <w:jc w:val="left"/>
                         </w:pPr>
                         <w:r>
-                          <w:t xml:space="preserve"> </w:t>
+                          <w:t xml:space="preserve"/>
                         </w:r>
                       </w:p>
                     </w:txbxContent>
@@ -5311,7 +5311,7 @@
                             <w:rFonts w:ascii="Georgia" w:eastAsia="Georgia" w:hAnsi="Georgia" w:cs="Georgia"/>
                             <w:sz w:val="32"/>
                           </w:rPr>
-                          <w:t>...............................................................................................</w:t>
+                          <w:t/>
                         </w:r>
                       </w:p>
                     </w:txbxContent>
@@ -5331,7 +5331,7 @@
                             <w:rFonts w:ascii="Georgia" w:eastAsia="Georgia" w:hAnsi="Georgia" w:cs="Georgia"/>
                             <w:sz w:val="32"/>
                           </w:rPr>
-                          <w:t xml:space="preserve"> </w:t>
+                          <w:t xml:space="preserve"/>
                         </w:r>
                       </w:p>
                     </w:txbxContent>
@@ -5347,7 +5347,7 @@
                           <w:jc w:val="left"/>
                         </w:pPr>
                         <w:r>
-                          <w:t xml:space="preserve"> </w:t>
+                          <w:t xml:space="preserve"/>
                         </w:r>
                       </w:p>
                     </w:txbxContent>
@@ -5363,7 +5363,7 @@
                           <w:jc w:val="left"/>
                         </w:pPr>
                         <w:r>
-                          <w:t xml:space="preserve"> </w:t>
+                          <w:t xml:space="preserve"/>
                         </w:r>
                       </w:p>
                     </w:txbxContent>
@@ -5379,7 +5379,7 @@
                           <w:jc w:val="left"/>
                         </w:pPr>
                         <w:r>
-                          <w:t xml:space="preserve"> </w:t>
+                          <w:t xml:space="preserve"/>
                         </w:r>
                       </w:p>
                     </w:txbxContent>
@@ -5395,7 +5395,7 @@
                           <w:jc w:val="left"/>
                         </w:pPr>
                         <w:r>
-                          <w:t xml:space="preserve"> </w:t>
+                          <w:t xml:space="preserve"/>
                         </w:r>
                       </w:p>
                     </w:txbxContent>
@@ -5411,7 +5411,7 @@
                           <w:jc w:val="left"/>
                         </w:pPr>
                         <w:r>
-                          <w:t xml:space="preserve"> </w:t>
+                          <w:t xml:space="preserve"/>
                         </w:r>
                       </w:p>
                     </w:txbxContent>
@@ -5432,7 +5432,7 @@
                             <w:b/>
                             <w:sz w:val="18"/>
                           </w:rPr>
-                          <w:t>PREPARED BY</w:t>
+                          <w:t/>
                         </w:r>
                       </w:p>
                     </w:txbxContent>
@@ -5453,7 +5453,7 @@
                             <w:b/>
                             <w:sz w:val="18"/>
                           </w:rPr>
-                          <w:t xml:space="preserve"> </w:t>
+                          <w:t xml:space="preserve"/>
                         </w:r>
                       </w:p>
                     </w:txbxContent>
@@ -5469,7 +5469,7 @@
                           <w:jc w:val="left"/>
                         </w:pPr>
                         <w:r>
-                          <w:t xml:space="preserve"> </w:t>
+                          <w:t xml:space="preserve"/>
                         </w:r>
                       </w:p>
                     </w:txbxContent>
@@ -5490,7 +5490,7 @@
                             <w:b/>
                             <w:sz w:val="18"/>
                           </w:rPr>
-                          <w:t>D. O AROWOSAFE Esq.</w:t>
+                          <w:t/>
                         </w:r>
                       </w:p>
                     </w:txbxContent>
@@ -5511,7 +5511,7 @@
                             <w:b/>
                             <w:sz w:val="18"/>
                           </w:rPr>
-                          <w:t xml:space="preserve"> </w:t>
+                          <w:t xml:space="preserve"/>
                         </w:r>
                       </w:p>
                     </w:txbxContent>
@@ -5527,7 +5527,7 @@
                           <w:jc w:val="left"/>
                         </w:pPr>
                         <w:r>
-                          <w:t xml:space="preserve"> </w:t>
+                          <w:t xml:space="preserve"/>
                         </w:r>
                       </w:p>
                     </w:txbxContent>
@@ -5548,7 +5548,7 @@
                             <w:b/>
                             <w:sz w:val="18"/>
                           </w:rPr>
-                          <w:t>FOR: LEGAL DEPARTMENT,</w:t>
+                          <w:t/>
                         </w:r>
                       </w:p>
                     </w:txbxContent>
@@ -5569,7 +5569,7 @@
                             <w:b/>
                             <w:sz w:val="18"/>
                           </w:rPr>
-                          <w:t xml:space="preserve"> </w:t>
+                          <w:t xml:space="preserve"/>
                         </w:r>
                       </w:p>
                     </w:txbxContent>
@@ -5585,7 +5585,7 @@
                           <w:jc w:val="left"/>
                         </w:pPr>
                         <w:r>
-                          <w:t xml:space="preserve"> </w:t>
+                          <w:t xml:space="preserve"/>
                         </w:r>
                       </w:p>
                     </w:txbxContent>
@@ -5606,7 +5606,7 @@
                             <w:b/>
                             <w:sz w:val="18"/>
                           </w:rPr>
-                          <w:t>LANDCULTURE INVESTMENT LTD,</w:t>
+                          <w:t/>
                         </w:r>
                       </w:p>
                     </w:txbxContent>
@@ -5627,7 +5627,7 @@
                             <w:b/>
                             <w:sz w:val="18"/>
                           </w:rPr>
-                          <w:t xml:space="preserve"> </w:t>
+                          <w:t xml:space="preserve"/>
                         </w:r>
                       </w:p>
                     </w:txbxContent>
@@ -5643,7 +5643,7 @@
                           <w:jc w:val="left"/>
                         </w:pPr>
                         <w:r>
-                          <w:t xml:space="preserve"> </w:t>
+                          <w:t xml:space="preserve"/>
                         </w:r>
                       </w:p>
                     </w:txbxContent>
@@ -5664,7 +5664,7 @@
                             <w:b/>
                             <w:sz w:val="18"/>
                           </w:rPr>
-                          <w:t>PLOT 6, OLD JEBBA ROAD, BES</w:t>
+                          <w:t/>
                         </w:r>
                       </w:p>
                     </w:txbxContent>
@@ -5685,7 +5685,7 @@
                             <w:b/>
                             <w:sz w:val="18"/>
                           </w:rPr>
-                          <w:t>IDE IPMAN</w:t>
+                          <w:t/>
                         </w:r>
                       </w:p>
                     </w:txbxContent>
@@ -5706,7 +5706,7 @@
                             <w:b/>
                             <w:sz w:val="18"/>
                           </w:rPr>
-                          <w:t xml:space="preserve"> </w:t>
+                          <w:t xml:space="preserve"/>
                         </w:r>
                       </w:p>
                     </w:txbxContent>
@@ -5727,7 +5727,7 @@
                             <w:b/>
                             <w:sz w:val="18"/>
                           </w:rPr>
-                          <w:t>BUI</w:t>
+                          <w:t/>
                         </w:r>
                       </w:p>
                     </w:txbxContent>
@@ -5748,7 +5748,7 @@
                             <w:b/>
                             <w:sz w:val="18"/>
                           </w:rPr>
-                          <w:t>LD</w:t>
+                          <w:t/>
                         </w:r>
                       </w:p>
                     </w:txbxContent>
@@ -5769,7 +5769,7 @@
                             <w:b/>
                             <w:sz w:val="18"/>
                           </w:rPr>
-                          <w:t>ING</w:t>
+                          <w:t/>
                         </w:r>
                       </w:p>
                     </w:txbxContent>
@@ -5790,7 +5790,7 @@
                             <w:b/>
                             <w:sz w:val="18"/>
                           </w:rPr>
-                          <w:t>,</w:t>
+                          <w:t/>
                         </w:r>
                       </w:p>
                     </w:txbxContent>
@@ -5811,7 +5811,7 @@
                             <w:b/>
                             <w:sz w:val="18"/>
                           </w:rPr>
-                          <w:t xml:space="preserve"> </w:t>
+                          <w:t xml:space="preserve"/>
                         </w:r>
                       </w:p>
                     </w:txbxContent>
@@ -5827,7 +5827,7 @@
                           <w:jc w:val="left"/>
                         </w:pPr>
                         <w:r>
-                          <w:t xml:space="preserve"> </w:t>
+                          <w:t xml:space="preserve"/>
                         </w:r>
                       </w:p>
                     </w:txbxContent>
@@ -5848,7 +5848,7 @@
                             <w:b/>
                             <w:sz w:val="18"/>
                           </w:rPr>
-                          <w:t>S</w:t>
+                          <w:t/>
                         </w:r>
                       </w:p>
                     </w:txbxContent>
@@ -5869,7 +5869,7 @@
                             <w:b/>
                             <w:sz w:val="18"/>
                           </w:rPr>
-                          <w:t>A</w:t>
+                          <w:t/>
                         </w:r>
                       </w:p>
                     </w:txbxContent>
@@ -5890,7 +5890,7 @@
                             <w:b/>
                             <w:sz w:val="18"/>
                           </w:rPr>
-                          <w:t>NGO, ILORIN, KWARA STATE.</w:t>
+                          <w:t/>
                         </w:r>
                       </w:p>
                     </w:txbxContent>
@@ -5911,7 +5911,7 @@
                             <w:b/>
                             <w:sz w:val="18"/>
                           </w:rPr>
-                          <w:t xml:space="preserve"> </w:t>
+                          <w:t xml:space="preserve"/>
                         </w:r>
                       </w:p>
                     </w:txbxContent>
@@ -5934,7 +5934,7 @@
         <w:rPr>
           <w:b/>
         </w:rPr>
-        <w:t xml:space="preserve">This CONTRACT OF SALE is made this {{CONTRACT_DAY}} Day of {{CONTRACT_MONTH}} {{CONTRACT_YEAR}}. </w:t>
+        <w:t xml:space="preserve">This CONTRACT OF SALE is made this ……...Day of…………………. 2026. </w:t>
       </w:r>
     </w:p>
     <w:p>

</xml_diff>

<commit_message>
Rebuild template from original — fix cover page layout and restore all body placeholders
https://claude.ai/code/session_01XNwruHkNzzkACBuMPFnptn
</commit_message>
<xml_diff>
--- a/contract_template.docx
+++ b/contract_template.docx
@@ -84,7 +84,7 @@
                                   <w:b/>
                                   <w:sz w:val="44"/>
                                 </w:rPr>
-                                <w:t xml:space="preserve"> CONTRACT OF SALE     BETWEEN     LANDCULTURE INVESTMENT LTD  The VENDOR)(     AND     {{CUSTOMER_NAME}}  (The PURCHASER)      IN RESPECT OF {{NUM_PLOTS_WORDS_UPPER}} PLOTS OF LAND MEASURING {{PLOT_SIZE_SQM}} SQUARE METERS SITUATE AT ALAFIA GARDENS, LOCATED AT WARA COMMUNITY, ALONG EIYENKORIN EXPRESS ROAD KWARA STATE.  ...............................................................................................      PREPARED BY  D. O AROWOSAFE Esq.  FOR: LEGAL DEPARTMENT,  LANDCULTURE INVESTMENT LTD,  PLOT 6, OLD JEBBA ROAD, BESIDE IPMAN BUILDING,  SANGO, ILORIN, KWARA STATE.  CONTRACT OF SALE     BETWEEN     LANDCULTURE INVESTMENT LTD  The VENDOR)(     AND     {{CUSTOMER_NAME}}  (The PURCHASER)      IN RESPECT OF {{NUM_PLOTS_WORDS_UPPER}} PLOTS OF LAND MEASURING {{PLOT_SIZE_SQM}} SQUARE METERS SITUATE AT ALAFIA GARDENS, LOCATED AT WARA COMMUNITY, ALONG EIYENKORIN EXPRESS ROAD KWARA STATE.  ...............................................................................................      PREPARED BY  D. O AROWOSAFE Esq.  FOR: LEGAL DEPARTMENT,  LANDCULTURE INVESTMENT LTD,  PLOT 6, OLD JEBBA ROAD, BESIDE IPMAN BUILDING,  SANGO, ILORIN, KWARA STATE. </w:t>
+                                <w:t xml:space="preserve"> </w:t>
                               </w:r>
                             </w:p>
                           </w:txbxContent>
@@ -122,7 +122,7 @@
                                   <w:b/>
                                   <w:sz w:val="44"/>
                                 </w:rPr>
-                                <w:t/>
+                                <w:t>CONTRACT OF SALE</w:t>
                               </w:r>
                             </w:p>
                           </w:txbxContent>
@@ -160,7 +160,7 @@
                                   <w:b/>
                                   <w:sz w:val="44"/>
                                 </w:rPr>
-                                <w:t xml:space="preserve"/>
+                                <w:t xml:space="preserve"> </w:t>
                               </w:r>
                             </w:p>
                           </w:txbxContent>
@@ -193,7 +193,7 @@
                                 <w:jc w:val="left"/>
                               </w:pPr>
                               <w:r>
-                                <w:t xml:space="preserve"/>
+                                <w:t xml:space="preserve"> </w:t>
                               </w:r>
                             </w:p>
                           </w:txbxContent>
@@ -226,7 +226,7 @@
                                 <w:jc w:val="left"/>
                               </w:pPr>
                               <w:r>
-                                <w:t xml:space="preserve"/>
+                                <w:t xml:space="preserve"> </w:t>
                               </w:r>
                             </w:p>
                           </w:txbxContent>
@@ -259,7 +259,7 @@
                                 <w:jc w:val="left"/>
                               </w:pPr>
                               <w:r>
-                                <w:t xml:space="preserve"/>
+                                <w:t xml:space="preserve"> </w:t>
                               </w:r>
                             </w:p>
                           </w:txbxContent>
@@ -292,7 +292,7 @@
                                 <w:jc w:val="left"/>
                               </w:pPr>
                               <w:r>
-                                <w:t xml:space="preserve"/>
+                                <w:t xml:space="preserve"> </w:t>
                               </w:r>
                             </w:p>
                           </w:txbxContent>
@@ -329,7 +329,7 @@
                                   <w:rFonts w:ascii="Georgia" w:eastAsia="Georgia" w:hAnsi="Georgia" w:cs="Georgia"/>
                                   <w:b/>
                                 </w:rPr>
-                                <w:t/>
+                                <w:t>BETWEEN</w:t>
                               </w:r>
                             </w:p>
                           </w:txbxContent>
@@ -366,7 +366,7 @@
                                   <w:rFonts w:ascii="Georgia" w:eastAsia="Georgia" w:hAnsi="Georgia" w:cs="Georgia"/>
                                   <w:b/>
                                 </w:rPr>
-                                <w:t xml:space="preserve"/>
+                                <w:t xml:space="preserve"> </w:t>
                               </w:r>
                             </w:p>
                           </w:txbxContent>
@@ -399,7 +399,7 @@
                                 <w:jc w:val="left"/>
                               </w:pPr>
                               <w:r>
-                                <w:t xml:space="preserve"/>
+                                <w:t xml:space="preserve"> </w:t>
                               </w:r>
                             </w:p>
                           </w:txbxContent>
@@ -432,7 +432,7 @@
                                 <w:jc w:val="left"/>
                               </w:pPr>
                               <w:r>
-                                <w:t xml:space="preserve"/>
+                                <w:t xml:space="preserve"> </w:t>
                               </w:r>
                             </w:p>
                           </w:txbxContent>
@@ -465,7 +465,7 @@
                                 <w:jc w:val="left"/>
                               </w:pPr>
                               <w:r>
-                                <w:t xml:space="preserve"/>
+                                <w:t xml:space="preserve"> </w:t>
                               </w:r>
                             </w:p>
                           </w:txbxContent>
@@ -498,7 +498,7 @@
                                 <w:jc w:val="left"/>
                               </w:pPr>
                               <w:r>
-                                <w:t xml:space="preserve"/>
+                                <w:t xml:space="preserve"> </w:t>
                               </w:r>
                             </w:p>
                           </w:txbxContent>
@@ -536,7 +536,7 @@
                                   <w:b/>
                                   <w:sz w:val="32"/>
                                 </w:rPr>
-                                <w:t/>
+                                <w:t>LANDCULTURE INVESTMENT LTD</w:t>
                               </w:r>
                             </w:p>
                           </w:txbxContent>
@@ -574,7 +574,7 @@
                                   <w:b/>
                                   <w:sz w:val="32"/>
                                 </w:rPr>
-                                <w:t xml:space="preserve"/>
+                                <w:t xml:space="preserve"> </w:t>
                               </w:r>
                             </w:p>
                           </w:txbxContent>
@@ -607,7 +607,7 @@
                                 <w:jc w:val="left"/>
                               </w:pPr>
                               <w:r>
-                                <w:t xml:space="preserve"/>
+                                <w:t xml:space="preserve"> </w:t>
                               </w:r>
                             </w:p>
                           </w:txbxContent>
@@ -644,7 +644,7 @@
                                   <w:rFonts w:ascii="Georgia" w:eastAsia="Georgia" w:hAnsi="Georgia" w:cs="Georgia"/>
                                   <w:sz w:val="22"/>
                                 </w:rPr>
-                                <w:t/>
+                                <w:t>The VENDOR</w:t>
                               </w:r>
                             </w:p>
                           </w:txbxContent>
@@ -755,7 +755,7 @@
                                   <w:rFonts w:ascii="Georgia" w:eastAsia="Georgia" w:hAnsi="Georgia" w:cs="Georgia"/>
                                   <w:sz w:val="22"/>
                                 </w:rPr>
-                                <w:t xml:space="preserve"/>
+                                <w:t xml:space="preserve"> </w:t>
                               </w:r>
                             </w:p>
                           </w:txbxContent>
@@ -788,7 +788,7 @@
                                 <w:jc w:val="left"/>
                               </w:pPr>
                               <w:r>
-                                <w:t xml:space="preserve"/>
+                                <w:t xml:space="preserve"> </w:t>
                               </w:r>
                             </w:p>
                           </w:txbxContent>
@@ -821,7 +821,7 @@
                                 <w:jc w:val="left"/>
                               </w:pPr>
                               <w:r>
-                                <w:t xml:space="preserve"/>
+                                <w:t xml:space="preserve"> </w:t>
                               </w:r>
                             </w:p>
                           </w:txbxContent>
@@ -854,7 +854,7 @@
                                 <w:jc w:val="left"/>
                               </w:pPr>
                               <w:r>
-                                <w:t xml:space="preserve"/>
+                                <w:t xml:space="preserve"> </w:t>
                               </w:r>
                             </w:p>
                           </w:txbxContent>
@@ -887,7 +887,7 @@
                                 <w:jc w:val="left"/>
                               </w:pPr>
                               <w:r>
-                                <w:t xml:space="preserve"/>
+                                <w:t xml:space="preserve"> </w:t>
                               </w:r>
                             </w:p>
                           </w:txbxContent>
@@ -925,7 +925,7 @@
                                   <w:b/>
                                   <w:sz w:val="20"/>
                                 </w:rPr>
-                                <w:t/>
+                                <w:t>AND</w:t>
                               </w:r>
                             </w:p>
                           </w:txbxContent>
@@ -963,7 +963,7 @@
                                   <w:b/>
                                   <w:sz w:val="20"/>
                                 </w:rPr>
-                                <w:t xml:space="preserve"/>
+                                <w:t xml:space="preserve"> </w:t>
                               </w:r>
                             </w:p>
                           </w:txbxContent>
@@ -996,7 +996,7 @@
                                 <w:jc w:val="left"/>
                               </w:pPr>
                               <w:r>
-                                <w:t xml:space="preserve"/>
+                                <w:t xml:space="preserve"> </w:t>
                               </w:r>
                             </w:p>
                           </w:txbxContent>
@@ -1029,7 +1029,7 @@
                                 <w:jc w:val="left"/>
                               </w:pPr>
                               <w:r>
-                                <w:t xml:space="preserve"/>
+                                <w:t xml:space="preserve"> </w:t>
                               </w:r>
                             </w:p>
                           </w:txbxContent>
@@ -1062,7 +1062,7 @@
                                 <w:jc w:val="left"/>
                               </w:pPr>
                               <w:r>
-                                <w:t xml:space="preserve"/>
+                                <w:t xml:space="preserve"> </w:t>
                               </w:r>
                             </w:p>
                           </w:txbxContent>
@@ -1095,7 +1095,7 @@
                                 <w:jc w:val="left"/>
                               </w:pPr>
                               <w:r>
-                                <w:t xml:space="preserve"/>
+                                <w:t xml:space="preserve"> </w:t>
                               </w:r>
                             </w:p>
                           </w:txbxContent>
@@ -1133,7 +1133,7 @@
                                   <w:b/>
                                   <w:sz w:val="32"/>
                                 </w:rPr>
-                                <w:t/>
+                                <w:t>{{CUSTOMER_NAME}}</w:t>
                               </w:r>
                             </w:p>
                           </w:txbxContent>
@@ -1171,7 +1171,7 @@
                                   <w:b/>
                                   <w:sz w:val="32"/>
                                 </w:rPr>
-                                <w:t xml:space="preserve"/>
+                                <w:t xml:space="preserve"> </w:t>
                               </w:r>
                             </w:p>
                           </w:txbxContent>
@@ -1204,7 +1204,7 @@
                                 <w:jc w:val="left"/>
                               </w:pPr>
                               <w:r>
-                                <w:t xml:space="preserve"/>
+                                <w:t xml:space="preserve"> </w:t>
                               </w:r>
                             </w:p>
                           </w:txbxContent>
@@ -1278,7 +1278,7 @@
                                   <w:rFonts w:ascii="Georgia" w:eastAsia="Georgia" w:hAnsi="Georgia" w:cs="Georgia"/>
                                   <w:sz w:val="22"/>
                                 </w:rPr>
-                                <w:t/>
+                                <w:t>The PURCHASER</w:t>
                               </w:r>
                             </w:p>
                           </w:txbxContent>
@@ -1352,7 +1352,7 @@
                                   <w:rFonts w:ascii="Georgia" w:eastAsia="Georgia" w:hAnsi="Georgia" w:cs="Georgia"/>
                                   <w:sz w:val="22"/>
                                 </w:rPr>
-                                <w:t xml:space="preserve"/>
+                                <w:t xml:space="preserve"> </w:t>
                               </w:r>
                             </w:p>
                           </w:txbxContent>
@@ -1385,7 +1385,7 @@
                                 <w:jc w:val="left"/>
                               </w:pPr>
                               <w:r>
-                                <w:t xml:space="preserve"/>
+                                <w:t xml:space="preserve"> </w:t>
                               </w:r>
                             </w:p>
                           </w:txbxContent>
@@ -1418,7 +1418,7 @@
                                 <w:jc w:val="left"/>
                               </w:pPr>
                               <w:r>
-                                <w:t xml:space="preserve"/>
+                                <w:t xml:space="preserve"> </w:t>
                               </w:r>
                             </w:p>
                           </w:txbxContent>
@@ -1451,7 +1451,7 @@
                                 <w:jc w:val="left"/>
                               </w:pPr>
                               <w:r>
-                                <w:t xml:space="preserve"/>
+                                <w:t xml:space="preserve"> </w:t>
                               </w:r>
                             </w:p>
                           </w:txbxContent>
@@ -1484,7 +1484,7 @@
                                 <w:jc w:val="left"/>
                               </w:pPr>
                               <w:r>
-                                <w:t xml:space="preserve"/>
+                                <w:t xml:space="preserve"> </w:t>
                               </w:r>
                             </w:p>
                           </w:txbxContent>
@@ -1517,7 +1517,7 @@
                                 <w:jc w:val="left"/>
                               </w:pPr>
                               <w:r>
-                                <w:t xml:space="preserve"/>
+                                <w:t xml:space="preserve"> </w:t>
                               </w:r>
                             </w:p>
                           </w:txbxContent>
@@ -1555,7 +1555,7 @@
                                   <w:b/>
                                   <w:sz w:val="32"/>
                                 </w:rPr>
-                                <w:t xml:space="preserve"/>
+                                <w:t xml:space="preserve">IN RESPECT OF </w:t>
                               </w:r>
                             </w:p>
                           </w:txbxContent>
@@ -1593,7 +1593,7 @@
                                   <w:b/>
                                   <w:sz w:val="32"/>
                                 </w:rPr>
-                                <w:t/>
+                                <w:t>{{NUM_PLOTS_WORDS_UPPER}} PLOTS</w:t>
                               </w:r>
                             </w:p>
                           </w:txbxContent>
@@ -1631,7 +1631,7 @@
                                   <w:b/>
                                   <w:sz w:val="32"/>
                                 </w:rPr>
-                                <w:t xml:space="preserve"/>
+                                <w:t xml:space="preserve"> </w:t>
                               </w:r>
                             </w:p>
                           </w:txbxContent>
@@ -1859,7 +1859,7 @@
                                   <w:b/>
                                   <w:sz w:val="32"/>
                                 </w:rPr>
-                                <w:t xml:space="preserve"/>
+                                <w:t xml:space="preserve"> </w:t>
                               </w:r>
                             </w:p>
                           </w:txbxContent>
@@ -1897,7 +1897,7 @@
                                   <w:b/>
                                   <w:sz w:val="32"/>
                                 </w:rPr>
-                                <w:t xml:space="preserve"/>
+                                <w:t xml:space="preserve">OF LAND </w:t>
                               </w:r>
                             </w:p>
                           </w:txbxContent>
@@ -1935,7 +1935,7 @@
                                   <w:b/>
                                   <w:sz w:val="32"/>
                                 </w:rPr>
-                                <w:t xml:space="preserve"/>
+                                <w:t xml:space="preserve">MEASURING </w:t>
                               </w:r>
                             </w:p>
                           </w:txbxContent>
@@ -1973,7 +1973,7 @@
                                   <w:b/>
                                   <w:sz w:val="32"/>
                                 </w:rPr>
-                                <w:t/>
+                                <w:t>{{PLOT_SIZE_SQM}}</w:t>
                               </w:r>
                             </w:p>
                           </w:txbxContent>
@@ -2011,7 +2011,7 @@
                                   <w:b/>
                                   <w:sz w:val="32"/>
                                 </w:rPr>
-                                <w:t xml:space="preserve"/>
+                                <w:t xml:space="preserve"> </w:t>
                               </w:r>
                             </w:p>
                           </w:txbxContent>
@@ -2049,7 +2049,7 @@
                                   <w:b/>
                                   <w:sz w:val="32"/>
                                 </w:rPr>
-                                <w:t xml:space="preserve"/>
+                                <w:t xml:space="preserve">SQUARE METERS SITUATE AT </w:t>
                               </w:r>
                             </w:p>
                           </w:txbxContent>
@@ -2087,7 +2087,7 @@
                                   <w:b/>
                                   <w:sz w:val="32"/>
                                 </w:rPr>
-                                <w:t/>
+                                <w:t>ALAFIA GARDENS, LOCATE</w:t>
                               </w:r>
                             </w:p>
                           </w:txbxContent>
@@ -2125,7 +2125,7 @@
                                   <w:b/>
                                   <w:sz w:val="32"/>
                                 </w:rPr>
-                                <w:t xml:space="preserve"/>
+                                <w:t xml:space="preserve">D AT WARA </w:t>
                               </w:r>
                             </w:p>
                           </w:txbxContent>
@@ -2163,7 +2163,7 @@
                                   <w:b/>
                                   <w:sz w:val="32"/>
                                 </w:rPr>
-                                <w:t xml:space="preserve"/>
+                                <w:t xml:space="preserve">COMMUNITY, </w:t>
                               </w:r>
                             </w:p>
                           </w:txbxContent>
@@ -2201,7 +2201,7 @@
                                   <w:b/>
                                   <w:sz w:val="32"/>
                                 </w:rPr>
-                                <w:t/>
+                                <w:t>ALO</w:t>
                               </w:r>
                             </w:p>
                           </w:txbxContent>
@@ -2239,7 +2239,7 @@
                                   <w:b/>
                                   <w:sz w:val="32"/>
                                 </w:rPr>
-                                <w:t/>
+                                <w:t>NG E</w:t>
                               </w:r>
                             </w:p>
                           </w:txbxContent>
@@ -2277,7 +2277,7 @@
                                   <w:b/>
                                   <w:sz w:val="32"/>
                                 </w:rPr>
-                                <w:t/>
+                                <w:t>I</w:t>
                               </w:r>
                             </w:p>
                           </w:txbxContent>
@@ -2315,7 +2315,7 @@
                                   <w:b/>
                                   <w:sz w:val="32"/>
                                 </w:rPr>
-                                <w:t/>
+                                <w:t>YENKORIN</w:t>
                               </w:r>
                             </w:p>
                           </w:txbxContent>
@@ -2353,7 +2353,7 @@
                                   <w:b/>
                                   <w:sz w:val="32"/>
                                 </w:rPr>
-                                <w:t xml:space="preserve"/>
+                                <w:t xml:space="preserve"> </w:t>
                               </w:r>
                             </w:p>
                           </w:txbxContent>
@@ -2391,7 +2391,7 @@
                                   <w:b/>
                                   <w:sz w:val="32"/>
                                 </w:rPr>
-                                <w:t/>
+                                <w:t>E</w:t>
                               </w:r>
                             </w:p>
                           </w:txbxContent>
@@ -2429,7 +2429,7 @@
                                   <w:b/>
                                   <w:sz w:val="32"/>
                                 </w:rPr>
-                                <w:t/>
+                                <w:t>XPR</w:t>
                               </w:r>
                             </w:p>
                           </w:txbxContent>
@@ -2467,7 +2467,7 @@
                                   <w:b/>
                                   <w:sz w:val="32"/>
                                 </w:rPr>
-                                <w:t/>
+                                <w:t>ESS</w:t>
                               </w:r>
                             </w:p>
                           </w:txbxContent>
@@ -2505,7 +2505,7 @@
                                   <w:b/>
                                   <w:sz w:val="32"/>
                                 </w:rPr>
-                                <w:t xml:space="preserve"/>
+                                <w:t xml:space="preserve"> </w:t>
                               </w:r>
                             </w:p>
                           </w:txbxContent>
@@ -2543,7 +2543,7 @@
                                   <w:b/>
                                   <w:sz w:val="32"/>
                                 </w:rPr>
-                                <w:t/>
+                                <w:t>R</w:t>
                               </w:r>
                             </w:p>
                           </w:txbxContent>
@@ -2581,7 +2581,7 @@
                                   <w:b/>
                                   <w:sz w:val="32"/>
                                 </w:rPr>
-                                <w:t xml:space="preserve"/>
+                                <w:t xml:space="preserve">OAD </w:t>
                               </w:r>
                             </w:p>
                           </w:txbxContent>
@@ -2619,7 +2619,7 @@
                                   <w:b/>
                                   <w:sz w:val="32"/>
                                 </w:rPr>
-                                <w:t/>
+                                <w:t>KWARA STATE.</w:t>
                               </w:r>
                             </w:p>
                           </w:txbxContent>
@@ -2657,7 +2657,7 @@
                                   <w:b/>
                                   <w:sz w:val="32"/>
                                 </w:rPr>
-                                <w:t xml:space="preserve"/>
+                                <w:t xml:space="preserve"> </w:t>
                               </w:r>
                             </w:p>
                           </w:txbxContent>
@@ -2690,7 +2690,7 @@
                                 <w:jc w:val="left"/>
                               </w:pPr>
                               <w:r>
-                                <w:t xml:space="preserve"/>
+                                <w:t xml:space="preserve"> </w:t>
                               </w:r>
                             </w:p>
                           </w:txbxContent>
@@ -2727,7 +2727,7 @@
                                   <w:rFonts w:ascii="Georgia" w:eastAsia="Georgia" w:hAnsi="Georgia" w:cs="Georgia"/>
                                   <w:sz w:val="32"/>
                                 </w:rPr>
-                                <w:t/>
+                                <w:t>...............................................................................................</w:t>
                               </w:r>
                             </w:p>
                           </w:txbxContent>
@@ -2764,7 +2764,7 @@
                                   <w:rFonts w:ascii="Georgia" w:eastAsia="Georgia" w:hAnsi="Georgia" w:cs="Georgia"/>
                                   <w:sz w:val="32"/>
                                 </w:rPr>
-                                <w:t xml:space="preserve"/>
+                                <w:t xml:space="preserve"> </w:t>
                               </w:r>
                             </w:p>
                           </w:txbxContent>
@@ -2797,7 +2797,7 @@
                                 <w:jc w:val="left"/>
                               </w:pPr>
                               <w:r>
-                                <w:t xml:space="preserve"/>
+                                <w:t xml:space="preserve"> </w:t>
                               </w:r>
                             </w:p>
                           </w:txbxContent>
@@ -2830,7 +2830,7 @@
                                 <w:jc w:val="left"/>
                               </w:pPr>
                               <w:r>
-                                <w:t xml:space="preserve"/>
+                                <w:t xml:space="preserve"> </w:t>
                               </w:r>
                             </w:p>
                           </w:txbxContent>
@@ -2863,7 +2863,7 @@
                                 <w:jc w:val="left"/>
                               </w:pPr>
                               <w:r>
-                                <w:t xml:space="preserve"/>
+                                <w:t xml:space="preserve"> </w:t>
                               </w:r>
                             </w:p>
                           </w:txbxContent>
@@ -2896,7 +2896,7 @@
                                 <w:jc w:val="left"/>
                               </w:pPr>
                               <w:r>
-                                <w:t xml:space="preserve"/>
+                                <w:t xml:space="preserve"> </w:t>
                               </w:r>
                             </w:p>
                           </w:txbxContent>
@@ -2929,7 +2929,7 @@
                                 <w:jc w:val="left"/>
                               </w:pPr>
                               <w:r>
-                                <w:t xml:space="preserve"/>
+                                <w:t xml:space="preserve"> </w:t>
                               </w:r>
                             </w:p>
                           </w:txbxContent>
@@ -2967,7 +2967,7 @@
                                   <w:b/>
                                   <w:sz w:val="18"/>
                                 </w:rPr>
-                                <w:t/>
+                                <w:t>PREPARED BY</w:t>
                               </w:r>
                             </w:p>
                           </w:txbxContent>
@@ -3005,7 +3005,7 @@
                                   <w:b/>
                                   <w:sz w:val="18"/>
                                 </w:rPr>
-                                <w:t xml:space="preserve"/>
+                                <w:t xml:space="preserve"> </w:t>
                               </w:r>
                             </w:p>
                           </w:txbxContent>
@@ -3038,7 +3038,7 @@
                                 <w:jc w:val="left"/>
                               </w:pPr>
                               <w:r>
-                                <w:t xml:space="preserve"/>
+                                <w:t xml:space="preserve"> </w:t>
                               </w:r>
                             </w:p>
                           </w:txbxContent>
@@ -3076,7 +3076,7 @@
                                   <w:b/>
                                   <w:sz w:val="18"/>
                                 </w:rPr>
-                                <w:t/>
+                                <w:t>D. O AROWOSAFE Esq.</w:t>
                               </w:r>
                             </w:p>
                           </w:txbxContent>
@@ -3114,7 +3114,7 @@
                                   <w:b/>
                                   <w:sz w:val="18"/>
                                 </w:rPr>
-                                <w:t xml:space="preserve"/>
+                                <w:t xml:space="preserve"> </w:t>
                               </w:r>
                             </w:p>
                           </w:txbxContent>
@@ -3147,7 +3147,7 @@
                                 <w:jc w:val="left"/>
                               </w:pPr>
                               <w:r>
-                                <w:t xml:space="preserve"/>
+                                <w:t xml:space="preserve"> </w:t>
                               </w:r>
                             </w:p>
                           </w:txbxContent>
@@ -3185,7 +3185,7 @@
                                   <w:b/>
                                   <w:sz w:val="18"/>
                                 </w:rPr>
-                                <w:t/>
+                                <w:t>FOR: LEGAL DEPARTMENT,</w:t>
                               </w:r>
                             </w:p>
                           </w:txbxContent>
@@ -3223,7 +3223,7 @@
                                   <w:b/>
                                   <w:sz w:val="18"/>
                                 </w:rPr>
-                                <w:t xml:space="preserve"/>
+                                <w:t xml:space="preserve"> </w:t>
                               </w:r>
                             </w:p>
                           </w:txbxContent>
@@ -3256,7 +3256,7 @@
                                 <w:jc w:val="left"/>
                               </w:pPr>
                               <w:r>
-                                <w:t xml:space="preserve"/>
+                                <w:t xml:space="preserve"> </w:t>
                               </w:r>
                             </w:p>
                           </w:txbxContent>
@@ -3294,7 +3294,7 @@
                                   <w:b/>
                                   <w:sz w:val="18"/>
                                 </w:rPr>
-                                <w:t/>
+                                <w:t>LANDCULTURE INVESTMENT LTD,</w:t>
                               </w:r>
                             </w:p>
                           </w:txbxContent>
@@ -3332,7 +3332,7 @@
                                   <w:b/>
                                   <w:sz w:val="18"/>
                                 </w:rPr>
-                                <w:t xml:space="preserve"/>
+                                <w:t xml:space="preserve"> </w:t>
                               </w:r>
                             </w:p>
                           </w:txbxContent>
@@ -3365,7 +3365,7 @@
                                 <w:jc w:val="left"/>
                               </w:pPr>
                               <w:r>
-                                <w:t xml:space="preserve"/>
+                                <w:t xml:space="preserve"> </w:t>
                               </w:r>
                             </w:p>
                           </w:txbxContent>
@@ -3403,7 +3403,7 @@
                                   <w:b/>
                                   <w:sz w:val="18"/>
                                 </w:rPr>
-                                <w:t/>
+                                <w:t>PLOT 6, OLD JEBBA ROAD, BES</w:t>
                               </w:r>
                             </w:p>
                           </w:txbxContent>
@@ -3441,7 +3441,7 @@
                                   <w:b/>
                                   <w:sz w:val="18"/>
                                 </w:rPr>
-                                <w:t/>
+                                <w:t>IDE IPMAN</w:t>
                               </w:r>
                             </w:p>
                           </w:txbxContent>
@@ -3479,7 +3479,7 @@
                                   <w:b/>
                                   <w:sz w:val="18"/>
                                 </w:rPr>
-                                <w:t xml:space="preserve"/>
+                                <w:t xml:space="preserve"> </w:t>
                               </w:r>
                             </w:p>
                           </w:txbxContent>
@@ -3517,7 +3517,7 @@
                                   <w:b/>
                                   <w:sz w:val="18"/>
                                 </w:rPr>
-                                <w:t/>
+                                <w:t>BUI</w:t>
                               </w:r>
                             </w:p>
                           </w:txbxContent>
@@ -3555,7 +3555,7 @@
                                   <w:b/>
                                   <w:sz w:val="18"/>
                                 </w:rPr>
-                                <w:t/>
+                                <w:t>LD</w:t>
                               </w:r>
                             </w:p>
                           </w:txbxContent>
@@ -3593,7 +3593,7 @@
                                   <w:b/>
                                   <w:sz w:val="18"/>
                                 </w:rPr>
-                                <w:t/>
+                                <w:t>ING</w:t>
                               </w:r>
                             </w:p>
                           </w:txbxContent>
@@ -3631,7 +3631,7 @@
                                   <w:b/>
                                   <w:sz w:val="18"/>
                                 </w:rPr>
-                                <w:t/>
+                                <w:t>,</w:t>
                               </w:r>
                             </w:p>
                           </w:txbxContent>
@@ -3669,7 +3669,7 @@
                                   <w:b/>
                                   <w:sz w:val="18"/>
                                 </w:rPr>
-                                <w:t xml:space="preserve"/>
+                                <w:t xml:space="preserve"> </w:t>
                               </w:r>
                             </w:p>
                           </w:txbxContent>
@@ -3702,7 +3702,7 @@
                                 <w:jc w:val="left"/>
                               </w:pPr>
                               <w:r>
-                                <w:t xml:space="preserve"/>
+                                <w:t xml:space="preserve"> </w:t>
                               </w:r>
                             </w:p>
                           </w:txbxContent>
@@ -3778,7 +3778,7 @@
                                   <w:b/>
                                   <w:sz w:val="18"/>
                                 </w:rPr>
-                                <w:t/>
+                                <w:t>A</w:t>
                               </w:r>
                             </w:p>
                           </w:txbxContent>
@@ -3816,7 +3816,7 @@
                                   <w:b/>
                                   <w:sz w:val="18"/>
                                 </w:rPr>
-                                <w:t/>
+                                <w:t>NGO, ILORIN, KWARA STATE.</w:t>
                               </w:r>
                             </w:p>
                           </w:txbxContent>
@@ -3854,7 +3854,7 @@
                                   <w:b/>
                                   <w:sz w:val="18"/>
                                 </w:rPr>
-                                <w:t xml:space="preserve"/>
+                                <w:t xml:space="preserve"> </w:t>
                               </w:r>
                             </w:p>
                           </w:txbxContent>
@@ -3909,7 +3909,7 @@
                             <w:b/>
                             <w:sz w:val="44"/>
                           </w:rPr>
-                          <w:t xml:space="preserve"/>
+                          <w:t xml:space="preserve"> </w:t>
                         </w:r>
                       </w:p>
                     </w:txbxContent>
@@ -3930,7 +3930,7 @@
                             <w:b/>
                             <w:sz w:val="44"/>
                           </w:rPr>
-                          <w:t/>
+                          <w:t>CONTRACT OF SALE</w:t>
                         </w:r>
                       </w:p>
                     </w:txbxContent>
@@ -3951,7 +3951,7 @@
                             <w:b/>
                             <w:sz w:val="44"/>
                           </w:rPr>
-                          <w:t xml:space="preserve"/>
+                          <w:t xml:space="preserve"> </w:t>
                         </w:r>
                       </w:p>
                     </w:txbxContent>
@@ -3967,7 +3967,7 @@
                           <w:jc w:val="left"/>
                         </w:pPr>
                         <w:r>
-                          <w:t xml:space="preserve"/>
+                          <w:t xml:space="preserve"> </w:t>
                         </w:r>
                       </w:p>
                     </w:txbxContent>
@@ -3983,7 +3983,7 @@
                           <w:jc w:val="left"/>
                         </w:pPr>
                         <w:r>
-                          <w:t xml:space="preserve"/>
+                          <w:t xml:space="preserve"> </w:t>
                         </w:r>
                       </w:p>
                     </w:txbxContent>
@@ -3999,7 +3999,7 @@
                           <w:jc w:val="left"/>
                         </w:pPr>
                         <w:r>
-                          <w:t xml:space="preserve"/>
+                          <w:t xml:space="preserve"> </w:t>
                         </w:r>
                       </w:p>
                     </w:txbxContent>
@@ -4015,7 +4015,7 @@
                           <w:jc w:val="left"/>
                         </w:pPr>
                         <w:r>
-                          <w:t xml:space="preserve"/>
+                          <w:t xml:space="preserve"> </w:t>
                         </w:r>
                       </w:p>
                     </w:txbxContent>
@@ -4035,7 +4035,7 @@
                             <w:rFonts w:ascii="Georgia" w:eastAsia="Georgia" w:hAnsi="Georgia" w:cs="Georgia"/>
                             <w:b/>
                           </w:rPr>
-                          <w:t/>
+                          <w:t>BETWEEN</w:t>
                         </w:r>
                       </w:p>
                     </w:txbxContent>
@@ -4055,7 +4055,7 @@
                             <w:rFonts w:ascii="Georgia" w:eastAsia="Georgia" w:hAnsi="Georgia" w:cs="Georgia"/>
                             <w:b/>
                           </w:rPr>
-                          <w:t xml:space="preserve"/>
+                          <w:t xml:space="preserve"> </w:t>
                         </w:r>
                       </w:p>
                     </w:txbxContent>
@@ -4071,7 +4071,7 @@
                           <w:jc w:val="left"/>
                         </w:pPr>
                         <w:r>
-                          <w:t xml:space="preserve"/>
+                          <w:t xml:space="preserve"> </w:t>
                         </w:r>
                       </w:p>
                     </w:txbxContent>
@@ -4087,7 +4087,7 @@
                           <w:jc w:val="left"/>
                         </w:pPr>
                         <w:r>
-                          <w:t xml:space="preserve"/>
+                          <w:t xml:space="preserve"> </w:t>
                         </w:r>
                       </w:p>
                     </w:txbxContent>
@@ -4103,7 +4103,7 @@
                           <w:jc w:val="left"/>
                         </w:pPr>
                         <w:r>
-                          <w:t xml:space="preserve"/>
+                          <w:t xml:space="preserve"> </w:t>
                         </w:r>
                       </w:p>
                     </w:txbxContent>
@@ -4119,7 +4119,7 @@
                           <w:jc w:val="left"/>
                         </w:pPr>
                         <w:r>
-                          <w:t xml:space="preserve"/>
+                          <w:t xml:space="preserve"> </w:t>
                         </w:r>
                       </w:p>
                     </w:txbxContent>
@@ -4140,7 +4140,7 @@
                             <w:b/>
                             <w:sz w:val="32"/>
                           </w:rPr>
-                          <w:t/>
+                          <w:t>LANDCULTURE INVESTMENT LTD</w:t>
                         </w:r>
                       </w:p>
                     </w:txbxContent>
@@ -4161,7 +4161,7 @@
                             <w:b/>
                             <w:sz w:val="32"/>
                           </w:rPr>
-                          <w:t xml:space="preserve"/>
+                          <w:t xml:space="preserve"> </w:t>
                         </w:r>
                       </w:p>
                     </w:txbxContent>
@@ -4177,7 +4177,7 @@
                           <w:jc w:val="left"/>
                         </w:pPr>
                         <w:r>
-                          <w:t xml:space="preserve"/>
+                          <w:t xml:space="preserve"> </w:t>
                         </w:r>
                       </w:p>
                     </w:txbxContent>
@@ -4197,7 +4197,7 @@
                             <w:rFonts w:ascii="Georgia" w:eastAsia="Georgia" w:hAnsi="Georgia" w:cs="Georgia"/>
                             <w:sz w:val="22"/>
                           </w:rPr>
-                          <w:t/>
+                          <w:t>The VENDOR</w:t>
                         </w:r>
                       </w:p>
                     </w:txbxContent>
@@ -4257,7 +4257,7 @@
                             <w:rFonts w:ascii="Georgia" w:eastAsia="Georgia" w:hAnsi="Georgia" w:cs="Georgia"/>
                             <w:sz w:val="22"/>
                           </w:rPr>
-                          <w:t xml:space="preserve"/>
+                          <w:t xml:space="preserve"> </w:t>
                         </w:r>
                       </w:p>
                     </w:txbxContent>
@@ -4273,7 +4273,7 @@
                           <w:jc w:val="left"/>
                         </w:pPr>
                         <w:r>
-                          <w:t xml:space="preserve"/>
+                          <w:t xml:space="preserve"> </w:t>
                         </w:r>
                       </w:p>
                     </w:txbxContent>
@@ -4289,7 +4289,7 @@
                           <w:jc w:val="left"/>
                         </w:pPr>
                         <w:r>
-                          <w:t xml:space="preserve"/>
+                          <w:t xml:space="preserve"> </w:t>
                         </w:r>
                       </w:p>
                     </w:txbxContent>
@@ -4305,7 +4305,7 @@
                           <w:jc w:val="left"/>
                         </w:pPr>
                         <w:r>
-                          <w:t xml:space="preserve"/>
+                          <w:t xml:space="preserve"> </w:t>
                         </w:r>
                       </w:p>
                     </w:txbxContent>
@@ -4321,7 +4321,7 @@
                           <w:jc w:val="left"/>
                         </w:pPr>
                         <w:r>
-                          <w:t xml:space="preserve"/>
+                          <w:t xml:space="preserve"> </w:t>
                         </w:r>
                       </w:p>
                     </w:txbxContent>
@@ -4342,7 +4342,7 @@
                             <w:b/>
                             <w:sz w:val="20"/>
                           </w:rPr>
-                          <w:t/>
+                          <w:t>AND</w:t>
                         </w:r>
                       </w:p>
                     </w:txbxContent>
@@ -4363,7 +4363,7 @@
                             <w:b/>
                             <w:sz w:val="20"/>
                           </w:rPr>
-                          <w:t xml:space="preserve"/>
+                          <w:t xml:space="preserve"> </w:t>
                         </w:r>
                       </w:p>
                     </w:txbxContent>
@@ -4379,7 +4379,7 @@
                           <w:jc w:val="left"/>
                         </w:pPr>
                         <w:r>
-                          <w:t xml:space="preserve"/>
+                          <w:t xml:space="preserve"> </w:t>
                         </w:r>
                       </w:p>
                     </w:txbxContent>
@@ -4395,7 +4395,7 @@
                           <w:jc w:val="left"/>
                         </w:pPr>
                         <w:r>
-                          <w:t xml:space="preserve"/>
+                          <w:t xml:space="preserve"> </w:t>
                         </w:r>
                       </w:p>
                     </w:txbxContent>
@@ -4411,7 +4411,7 @@
                           <w:jc w:val="left"/>
                         </w:pPr>
                         <w:r>
-                          <w:t xml:space="preserve"/>
+                          <w:t xml:space="preserve"> </w:t>
                         </w:r>
                       </w:p>
                     </w:txbxContent>
@@ -4427,7 +4427,7 @@
                           <w:jc w:val="left"/>
                         </w:pPr>
                         <w:r>
-                          <w:t xml:space="preserve"/>
+                          <w:t xml:space="preserve"> </w:t>
                         </w:r>
                       </w:p>
                     </w:txbxContent>
@@ -4448,7 +4448,7 @@
                             <w:b/>
                             <w:sz w:val="32"/>
                           </w:rPr>
-                          <w:t/>
+                          <w:t>{{CUSTOMER_NAME}}</w:t>
                         </w:r>
                       </w:p>
                     </w:txbxContent>
@@ -4469,7 +4469,7 @@
                             <w:b/>
                             <w:sz w:val="32"/>
                           </w:rPr>
-                          <w:t xml:space="preserve"/>
+                          <w:t xml:space="preserve"> </w:t>
                         </w:r>
                       </w:p>
                     </w:txbxContent>
@@ -4485,7 +4485,7 @@
                           <w:jc w:val="left"/>
                         </w:pPr>
                         <w:r>
-                          <w:t xml:space="preserve"/>
+                          <w:t xml:space="preserve"> </w:t>
                         </w:r>
                       </w:p>
                     </w:txbxContent>
@@ -4525,7 +4525,7 @@
                             <w:rFonts w:ascii="Georgia" w:eastAsia="Georgia" w:hAnsi="Georgia" w:cs="Georgia"/>
                             <w:sz w:val="22"/>
                           </w:rPr>
-                          <w:t/>
+                          <w:t>The PURCHASER</w:t>
                         </w:r>
                       </w:p>
                     </w:txbxContent>
@@ -4565,7 +4565,7 @@
                             <w:rFonts w:ascii="Georgia" w:eastAsia="Georgia" w:hAnsi="Georgia" w:cs="Georgia"/>
                             <w:sz w:val="22"/>
                           </w:rPr>
-                          <w:t xml:space="preserve"/>
+                          <w:t xml:space="preserve"> </w:t>
                         </w:r>
                       </w:p>
                     </w:txbxContent>
@@ -4581,7 +4581,7 @@
                           <w:jc w:val="left"/>
                         </w:pPr>
                         <w:r>
-                          <w:t xml:space="preserve"/>
+                          <w:t xml:space="preserve"> </w:t>
                         </w:r>
                       </w:p>
                     </w:txbxContent>
@@ -4597,7 +4597,7 @@
                           <w:jc w:val="left"/>
                         </w:pPr>
                         <w:r>
-                          <w:t xml:space="preserve"/>
+                          <w:t xml:space="preserve"> </w:t>
                         </w:r>
                       </w:p>
                     </w:txbxContent>
@@ -4613,7 +4613,7 @@
                           <w:jc w:val="left"/>
                         </w:pPr>
                         <w:r>
-                          <w:t xml:space="preserve"/>
+                          <w:t xml:space="preserve"> </w:t>
                         </w:r>
                       </w:p>
                     </w:txbxContent>
@@ -4629,7 +4629,7 @@
                           <w:jc w:val="left"/>
                         </w:pPr>
                         <w:r>
-                          <w:t xml:space="preserve"/>
+                          <w:t xml:space="preserve"> </w:t>
                         </w:r>
                       </w:p>
                     </w:txbxContent>
@@ -4645,7 +4645,7 @@
                           <w:jc w:val="left"/>
                         </w:pPr>
                         <w:r>
-                          <w:t xml:space="preserve"/>
+                          <w:t xml:space="preserve"> </w:t>
                         </w:r>
                       </w:p>
                     </w:txbxContent>
@@ -4666,7 +4666,7 @@
                             <w:b/>
                             <w:sz w:val="32"/>
                           </w:rPr>
-                          <w:t xml:space="preserve"/>
+                          <w:t xml:space="preserve">IN RESPECT OF </w:t>
                         </w:r>
                       </w:p>
                     </w:txbxContent>
@@ -4687,7 +4687,7 @@
                             <w:b/>
                             <w:sz w:val="32"/>
                           </w:rPr>
-                          <w:t/>
+                          <w:t>{{NUM_PLOTS_WORDS_UPPER}} PLOTS</w:t>
                         </w:r>
                       </w:p>
                     </w:txbxContent>
@@ -4708,7 +4708,7 @@
                             <w:b/>
                             <w:sz w:val="32"/>
                           </w:rPr>
-                          <w:t xml:space="preserve"/>
+                          <w:t xml:space="preserve"> </w:t>
                         </w:r>
                       </w:p>
                     </w:txbxContent>
@@ -4834,7 +4834,7 @@
                             <w:b/>
                             <w:sz w:val="32"/>
                           </w:rPr>
-                          <w:t xml:space="preserve"/>
+                          <w:t xml:space="preserve"> </w:t>
                         </w:r>
                       </w:p>
                     </w:txbxContent>
@@ -4855,7 +4855,7 @@
                             <w:b/>
                             <w:sz w:val="32"/>
                           </w:rPr>
-                          <w:t xml:space="preserve"/>
+                          <w:t xml:space="preserve">OF LAND </w:t>
                         </w:r>
                       </w:p>
                     </w:txbxContent>
@@ -4876,7 +4876,7 @@
                             <w:b/>
                             <w:sz w:val="32"/>
                           </w:rPr>
-                          <w:t xml:space="preserve"/>
+                          <w:t xml:space="preserve">MEASURING </w:t>
                         </w:r>
                       </w:p>
                     </w:txbxContent>
@@ -4897,7 +4897,7 @@
                             <w:b/>
                             <w:sz w:val="32"/>
                           </w:rPr>
-                          <w:t/>
+                          <w:t>{{PLOT_SIZE_SQM}}</w:t>
                         </w:r>
                       </w:p>
                     </w:txbxContent>
@@ -4918,7 +4918,7 @@
                             <w:b/>
                             <w:sz w:val="32"/>
                           </w:rPr>
-                          <w:t xml:space="preserve"/>
+                          <w:t xml:space="preserve"> </w:t>
                         </w:r>
                       </w:p>
                     </w:txbxContent>
@@ -4939,7 +4939,7 @@
                             <w:b/>
                             <w:sz w:val="32"/>
                           </w:rPr>
-                          <w:t xml:space="preserve"/>
+                          <w:t xml:space="preserve">SQUARE METERS SITUATE AT </w:t>
                         </w:r>
                       </w:p>
                     </w:txbxContent>
@@ -4960,7 +4960,7 @@
                             <w:b/>
                             <w:sz w:val="32"/>
                           </w:rPr>
-                          <w:t/>
+                          <w:t>ALAFIA GARDENS, LOCATE</w:t>
                         </w:r>
                       </w:p>
                     </w:txbxContent>
@@ -4981,7 +4981,7 @@
                             <w:b/>
                             <w:sz w:val="32"/>
                           </w:rPr>
-                          <w:t xml:space="preserve"/>
+                          <w:t xml:space="preserve">D AT WARA </w:t>
                         </w:r>
                       </w:p>
                     </w:txbxContent>
@@ -5002,7 +5002,7 @@
                             <w:b/>
                             <w:sz w:val="32"/>
                           </w:rPr>
-                          <w:t xml:space="preserve"/>
+                          <w:t xml:space="preserve">COMMUNITY, </w:t>
                         </w:r>
                       </w:p>
                     </w:txbxContent>
@@ -5023,7 +5023,7 @@
                             <w:b/>
                             <w:sz w:val="32"/>
                           </w:rPr>
-                          <w:t/>
+                          <w:t>ALO</w:t>
                         </w:r>
                       </w:p>
                     </w:txbxContent>
@@ -5044,7 +5044,7 @@
                             <w:b/>
                             <w:sz w:val="32"/>
                           </w:rPr>
-                          <w:t/>
+                          <w:t>NG E</w:t>
                         </w:r>
                       </w:p>
                     </w:txbxContent>
@@ -5065,7 +5065,7 @@
                             <w:b/>
                             <w:sz w:val="32"/>
                           </w:rPr>
-                          <w:t/>
+                          <w:t>I</w:t>
                         </w:r>
                       </w:p>
                     </w:txbxContent>
@@ -5086,7 +5086,7 @@
                             <w:b/>
                             <w:sz w:val="32"/>
                           </w:rPr>
-                          <w:t/>
+                          <w:t>YENKORIN</w:t>
                         </w:r>
                       </w:p>
                     </w:txbxContent>
@@ -5107,7 +5107,7 @@
                             <w:b/>
                             <w:sz w:val="32"/>
                           </w:rPr>
-                          <w:t xml:space="preserve"/>
+                          <w:t xml:space="preserve"> </w:t>
                         </w:r>
                       </w:p>
                     </w:txbxContent>
@@ -5128,7 +5128,7 @@
                             <w:b/>
                             <w:sz w:val="32"/>
                           </w:rPr>
-                          <w:t/>
+                          <w:t>E</w:t>
                         </w:r>
                       </w:p>
                     </w:txbxContent>
@@ -5149,7 +5149,7 @@
                             <w:b/>
                             <w:sz w:val="32"/>
                           </w:rPr>
-                          <w:t/>
+                          <w:t>XPR</w:t>
                         </w:r>
                       </w:p>
                     </w:txbxContent>
@@ -5170,7 +5170,7 @@
                             <w:b/>
                             <w:sz w:val="32"/>
                           </w:rPr>
-                          <w:t/>
+                          <w:t>ESS</w:t>
                         </w:r>
                       </w:p>
                     </w:txbxContent>
@@ -5191,7 +5191,7 @@
                             <w:b/>
                             <w:sz w:val="32"/>
                           </w:rPr>
-                          <w:t xml:space="preserve"/>
+                          <w:t xml:space="preserve"> </w:t>
                         </w:r>
                       </w:p>
                     </w:txbxContent>
@@ -5212,7 +5212,7 @@
                             <w:b/>
                             <w:sz w:val="32"/>
                           </w:rPr>
-                          <w:t/>
+                          <w:t>R</w:t>
                         </w:r>
                       </w:p>
                     </w:txbxContent>
@@ -5233,7 +5233,7 @@
                             <w:b/>
                             <w:sz w:val="32"/>
                           </w:rPr>
-                          <w:t xml:space="preserve"/>
+                          <w:t xml:space="preserve">OAD </w:t>
                         </w:r>
                       </w:p>
                     </w:txbxContent>
@@ -5254,7 +5254,7 @@
                             <w:b/>
                             <w:sz w:val="32"/>
                           </w:rPr>
-                          <w:t/>
+                          <w:t>KWARA STATE.</w:t>
                         </w:r>
                       </w:p>
                     </w:txbxContent>
@@ -5275,7 +5275,7 @@
                             <w:b/>
                             <w:sz w:val="32"/>
                           </w:rPr>
-                          <w:t xml:space="preserve"/>
+                          <w:t xml:space="preserve"> </w:t>
                         </w:r>
                       </w:p>
                     </w:txbxContent>
@@ -5291,7 +5291,7 @@
                           <w:jc w:val="left"/>
                         </w:pPr>
                         <w:r>
-                          <w:t xml:space="preserve"/>
+                          <w:t xml:space="preserve"> </w:t>
                         </w:r>
                       </w:p>
                     </w:txbxContent>
@@ -5311,7 +5311,7 @@
                             <w:rFonts w:ascii="Georgia" w:eastAsia="Georgia" w:hAnsi="Georgia" w:cs="Georgia"/>
                             <w:sz w:val="32"/>
                           </w:rPr>
-                          <w:t/>
+                          <w:t>...............................................................................................</w:t>
                         </w:r>
                       </w:p>
                     </w:txbxContent>
@@ -5331,7 +5331,7 @@
                             <w:rFonts w:ascii="Georgia" w:eastAsia="Georgia" w:hAnsi="Georgia" w:cs="Georgia"/>
                             <w:sz w:val="32"/>
                           </w:rPr>
-                          <w:t xml:space="preserve"/>
+                          <w:t xml:space="preserve"> </w:t>
                         </w:r>
                       </w:p>
                     </w:txbxContent>
@@ -5347,7 +5347,7 @@
                           <w:jc w:val="left"/>
                         </w:pPr>
                         <w:r>
-                          <w:t xml:space="preserve"/>
+                          <w:t xml:space="preserve"> </w:t>
                         </w:r>
                       </w:p>
                     </w:txbxContent>
@@ -5363,7 +5363,7 @@
                           <w:jc w:val="left"/>
                         </w:pPr>
                         <w:r>
-                          <w:t xml:space="preserve"/>
+                          <w:t xml:space="preserve"> </w:t>
                         </w:r>
                       </w:p>
                     </w:txbxContent>
@@ -5379,7 +5379,7 @@
                           <w:jc w:val="left"/>
                         </w:pPr>
                         <w:r>
-                          <w:t xml:space="preserve"/>
+                          <w:t xml:space="preserve"> </w:t>
                         </w:r>
                       </w:p>
                     </w:txbxContent>
@@ -5395,7 +5395,7 @@
                           <w:jc w:val="left"/>
                         </w:pPr>
                         <w:r>
-                          <w:t xml:space="preserve"/>
+                          <w:t xml:space="preserve"> </w:t>
                         </w:r>
                       </w:p>
                     </w:txbxContent>
@@ -5411,7 +5411,7 @@
                           <w:jc w:val="left"/>
                         </w:pPr>
                         <w:r>
-                          <w:t xml:space="preserve"/>
+                          <w:t xml:space="preserve"> </w:t>
                         </w:r>
                       </w:p>
                     </w:txbxContent>
@@ -5432,7 +5432,7 @@
                             <w:b/>
                             <w:sz w:val="18"/>
                           </w:rPr>
-                          <w:t/>
+                          <w:t>PREPARED BY</w:t>
                         </w:r>
                       </w:p>
                     </w:txbxContent>
@@ -5453,7 +5453,7 @@
                             <w:b/>
                             <w:sz w:val="18"/>
                           </w:rPr>
-                          <w:t xml:space="preserve"/>
+                          <w:t xml:space="preserve"> </w:t>
                         </w:r>
                       </w:p>
                     </w:txbxContent>
@@ -5469,7 +5469,7 @@
                           <w:jc w:val="left"/>
                         </w:pPr>
                         <w:r>
-                          <w:t xml:space="preserve"/>
+                          <w:t xml:space="preserve"> </w:t>
                         </w:r>
                       </w:p>
                     </w:txbxContent>
@@ -5490,7 +5490,7 @@
                             <w:b/>
                             <w:sz w:val="18"/>
                           </w:rPr>
-                          <w:t/>
+                          <w:t>D. O AROWOSAFE Esq.</w:t>
                         </w:r>
                       </w:p>
                     </w:txbxContent>
@@ -5511,7 +5511,7 @@
                             <w:b/>
                             <w:sz w:val="18"/>
                           </w:rPr>
-                          <w:t xml:space="preserve"/>
+                          <w:t xml:space="preserve"> </w:t>
                         </w:r>
                       </w:p>
                     </w:txbxContent>
@@ -5527,7 +5527,7 @@
                           <w:jc w:val="left"/>
                         </w:pPr>
                         <w:r>
-                          <w:t xml:space="preserve"/>
+                          <w:t xml:space="preserve"> </w:t>
                         </w:r>
                       </w:p>
                     </w:txbxContent>
@@ -5548,7 +5548,7 @@
                             <w:b/>
                             <w:sz w:val="18"/>
                           </w:rPr>
-                          <w:t/>
+                          <w:t>FOR: LEGAL DEPARTMENT,</w:t>
                         </w:r>
                       </w:p>
                     </w:txbxContent>
@@ -5569,7 +5569,7 @@
                             <w:b/>
                             <w:sz w:val="18"/>
                           </w:rPr>
-                          <w:t xml:space="preserve"/>
+                          <w:t xml:space="preserve"> </w:t>
                         </w:r>
                       </w:p>
                     </w:txbxContent>
@@ -5585,7 +5585,7 @@
                           <w:jc w:val="left"/>
                         </w:pPr>
                         <w:r>
-                          <w:t xml:space="preserve"/>
+                          <w:t xml:space="preserve"> </w:t>
                         </w:r>
                       </w:p>
                     </w:txbxContent>
@@ -5606,7 +5606,7 @@
                             <w:b/>
                             <w:sz w:val="18"/>
                           </w:rPr>
-                          <w:t/>
+                          <w:t>LANDCULTURE INVESTMENT LTD,</w:t>
                         </w:r>
                       </w:p>
                     </w:txbxContent>
@@ -5627,7 +5627,7 @@
                             <w:b/>
                             <w:sz w:val="18"/>
                           </w:rPr>
-                          <w:t xml:space="preserve"/>
+                          <w:t xml:space="preserve"> </w:t>
                         </w:r>
                       </w:p>
                     </w:txbxContent>
@@ -5643,7 +5643,7 @@
                           <w:jc w:val="left"/>
                         </w:pPr>
                         <w:r>
-                          <w:t xml:space="preserve"/>
+                          <w:t xml:space="preserve"> </w:t>
                         </w:r>
                       </w:p>
                     </w:txbxContent>
@@ -5664,7 +5664,7 @@
                             <w:b/>
                             <w:sz w:val="18"/>
                           </w:rPr>
-                          <w:t/>
+                          <w:t>PLOT 6, OLD JEBBA ROAD, BES</w:t>
                         </w:r>
                       </w:p>
                     </w:txbxContent>
@@ -5685,7 +5685,7 @@
                             <w:b/>
                             <w:sz w:val="18"/>
                           </w:rPr>
-                          <w:t/>
+                          <w:t>IDE IPMAN</w:t>
                         </w:r>
                       </w:p>
                     </w:txbxContent>
@@ -5706,7 +5706,7 @@
                             <w:b/>
                             <w:sz w:val="18"/>
                           </w:rPr>
-                          <w:t xml:space="preserve"/>
+                          <w:t xml:space="preserve"> </w:t>
                         </w:r>
                       </w:p>
                     </w:txbxContent>
@@ -5727,7 +5727,7 @@
                             <w:b/>
                             <w:sz w:val="18"/>
                           </w:rPr>
-                          <w:t/>
+                          <w:t>BUI</w:t>
                         </w:r>
                       </w:p>
                     </w:txbxContent>
@@ -5748,7 +5748,7 @@
                             <w:b/>
                             <w:sz w:val="18"/>
                           </w:rPr>
-                          <w:t/>
+                          <w:t>LD</w:t>
                         </w:r>
                       </w:p>
                     </w:txbxContent>
@@ -5769,7 +5769,7 @@
                             <w:b/>
                             <w:sz w:val="18"/>
                           </w:rPr>
-                          <w:t/>
+                          <w:t>ING</w:t>
                         </w:r>
                       </w:p>
                     </w:txbxContent>
@@ -5790,7 +5790,7 @@
                             <w:b/>
                             <w:sz w:val="18"/>
                           </w:rPr>
-                          <w:t/>
+                          <w:t>,</w:t>
                         </w:r>
                       </w:p>
                     </w:txbxContent>
@@ -5811,7 +5811,7 @@
                             <w:b/>
                             <w:sz w:val="18"/>
                           </w:rPr>
-                          <w:t xml:space="preserve"/>
+                          <w:t xml:space="preserve"> </w:t>
                         </w:r>
                       </w:p>
                     </w:txbxContent>
@@ -5827,7 +5827,7 @@
                           <w:jc w:val="left"/>
                         </w:pPr>
                         <w:r>
-                          <w:t xml:space="preserve"/>
+                          <w:t xml:space="preserve"> </w:t>
                         </w:r>
                       </w:p>
                     </w:txbxContent>
@@ -5869,7 +5869,7 @@
                             <w:b/>
                             <w:sz w:val="18"/>
                           </w:rPr>
-                          <w:t/>
+                          <w:t>A</w:t>
                         </w:r>
                       </w:p>
                     </w:txbxContent>
@@ -5890,7 +5890,7 @@
                             <w:b/>
                             <w:sz w:val="18"/>
                           </w:rPr>
-                          <w:t/>
+                          <w:t>NGO, ILORIN, KWARA STATE.</w:t>
                         </w:r>
                       </w:p>
                     </w:txbxContent>
@@ -5911,7 +5911,7 @@
                             <w:b/>
                             <w:sz w:val="18"/>
                           </w:rPr>
-                          <w:t xml:space="preserve"/>
+                          <w:t xml:space="preserve"> </w:t>
                         </w:r>
                       </w:p>
                     </w:txbxContent>
@@ -5934,6 +5934,7 @@
         <w:rPr>
           <w:b/>
         </w:rPr>
+        <w:lastRenderedPageBreak/>
         <w:t xml:space="preserve">This CONTRACT OF SALE is made this ……...Day of…………………. 2026. </w:t>
       </w:r>
     </w:p>
@@ -6123,27 +6124,23 @@
         <w:rPr>
           <w:b/>
         </w:rPr>
-        <w:t>{{CUSTOMER_NAME}}</w:t>
-      </w:r>
-      <w:r>
-        <w:t xml:space="preserve"> of </w:t>
-      </w:r>
-      <w:r>
-        <w:rPr>
-          <w:b/>
-        </w:rPr>
-        <w:t>{{CUSTOMER_ADDRESS}}</w:t>
+        <w:t>{{CUSTOMER_NAME}} of {{CUSTOMER_ADDRESS}}</w:t>
+        <w:tab/>
+        <w:t xml:space="preserve"> </w:t>
+      </w:r>
+      <w:r/>
+      <w:r>
+        <w:rPr>
+          <w:b/>
+        </w:rPr>
       </w:r>
       <w:r>
         <w:rPr>
           <w:rFonts w:ascii="Cambria" w:eastAsia="Cambria" w:hAnsi="Cambria" w:cs="Cambria"/>
           <w:vertAlign w:val="subscript"/>
         </w:rPr>
-        <w:tab/>
-      </w:r>
-      <w:r>
-        <w:t xml:space="preserve"> </w:t>
-      </w:r>
+      </w:r>
+      <w:r/>
     </w:p>
     <w:p>
       <w:pPr>
@@ -6563,7 +6560,7 @@
         <w:ind w:left="-3"/>
       </w:pPr>
       <w:r>
-        <w:t xml:space="preserve">out of which the sum of ₦{{DEPOSIT_DIGITS}} ({{DEPOSIT_WORDS}}) has been paid as deposit by the Purchaser to the Vendor (the receipt of which the Vendor acknowledges), the Vendor covenants to assign {{NUM_PLOTS_WORDS}} plot of land measuring {{PLOT_SIZE_SQM}} Square Meters located within Alafia Gardens situate at Wara Community, Along Eyenkorin Express Road, Ilorin, Kwara State to the Purchaser, subject to the terms and conditions contained in this Contract of Sale. </w:t>
+        <w:t xml:space="preserve">out of which the sum of ₦{{DEPOSIT_DIGITS}} ({{DEPOSIT_WORDS}}) has been paid as deposit by the Purchaser to the Vendor (the receipt of which the Vendor acknowledges), the Vendor covenants to assign {{NUM_PLOTS_WORDS_UPPER}} plot of land measuring {{PLOT_SIZE_SQM}} Square Meters located within Alafia Gardens situate at Wara Community, Along Eyenkorin Express Road, Ilorin, Kwara State to the Purchaser, subject to the terms and conditions contained in this Contract of Sale. </w:t>
       </w:r>
       <w:r>
         <w:rPr>
@@ -6675,7 +6672,7 @@
         <w:ind w:hanging="360"/>
       </w:pPr>
       <w:r>
-        <w:t xml:space="preserve">To promptly pay  the  balance  of  ₦{{BALANCE_DIGITS}} ({{BALANCE_WORDS}}), without default as at when due for the stipulated period which will commence from the day the purchaser made the first instalment being the {{PAYMENT_START_DATE}} and which shall be for a period of {{PAYMENT_DURATION_MONTHS}}months from the {{PAYMENT_START_DATE}} to the {{PAYMENT_END_DATE}} </w:t>
+        <w:t xml:space="preserve">To promptly pay  the  balance  of  ₦{{BALANCE_DIGITS}} ({{BALANCE_WORDS}}), without default as at when due for the stipulated period which will commence from the day the purchaser made the first instalment being the {{PAYMENT_START_DATE}} and which shall be for a period of {{PAYMENT_DURATION_MONTHS}}months from the 26th Day of March 2026 to the {{PAYMENT_END_DATE}} </w:t>
       </w:r>
       <w:r/>
       <w:proofErr w:type="gramStart"/>
@@ -7508,7 +7505,7 @@
         <w:ind w:hanging="360"/>
       </w:pPr>
       <w:r>
-        <w:t xml:space="preserve">To physically allocate {{NUM_PLOTS_WORDS}} plot of land measuring {{PLOT_SIZE_SQM}} Square Meters to the Purchaser upon further payment of at least 50% of the infrastructure fee, full payment of other developmental fees, payment for architectural drawing (whether prepared by the Vendor or external person or body) as stated in Clause 5(g) &amp; (h) herein and the execution of payment agreement (where applicable), indemnity and Construction </w:t>
+        <w:t xml:space="preserve">To physically allocate {{NUM_PLOTS_WORDS_UPPER}} plot of land measuring {{PLOT_SIZE_SQM}} Square Meters to the Purchaser upon further payment of at least 50% of the infrastructure fee, full payment of other developmental fees, payment for architectural drawing (whether prepared by the Vendor or external person or body) as stated in Clause 5(g) &amp; (h) herein and the execution of payment agreement (where applicable), indemnity and Construction </w:t>
       </w:r>
       <w:r>
         <w:rPr>
@@ -8137,7 +8134,7 @@
         <w:jc w:val="left"/>
       </w:pPr>
       <w:r>
-        <w:t xml:space="preserve">That the agreed price for {{NUM_PLOTS_WORDS}} plot of land measuring {{PLOT_SIZE_SQM}} Square Meters is ₦{{TOTAL_PRICE_DIGITS}} ({{TOTAL_PRICE_WORDS}}) only. </w:t>
+        <w:t xml:space="preserve">That the agreed price for {{NUM_PLOTS_WORDS_UPPER}} plot of land measuring {{PLOT_SIZE_SQM}} Square Meters is ₦{{TOTAL_PRICE_DIGITS}} ({{TOTAL_PRICE_WORDS}}) only. </w:t>
       </w:r>
       <w:r>
         <w:rPr>
@@ -10336,13 +10333,12 @@
         <w:rPr>
           <w:b/>
         </w:rPr>
-        <w:t>{{CUSTOMER_NAME}}</w:t>
-      </w:r>
-      <w:r>
-        <w:rPr>
-          <w:b/>
-        </w:rPr>
-        <w:t xml:space="preserve"> </w:t>
+        <w:t xml:space="preserve">{{CUSTOMER_NAME}} </w:t>
+      </w:r>
+      <w:r>
+        <w:rPr>
+          <w:b/>
+        </w:rPr>
       </w:r>
     </w:p>
     <w:p>

</xml_diff>

<commit_message>
Add page border to cover page
https://claude.ai/code/session_01XNwruHkNzzkACBuMPFnptn
</commit_message>
<xml_diff>
--- a/contract_template.docx
+++ b/contract_template.docx
@@ -4719,6 +4719,12 @@
       <w:pgSz w:w="12240" w:h="15840"/>
       <w:pgMar w:top="759" w:right="1440" w:bottom="201" w:left="1440" w:header="720" w:footer="720" w:gutter="0"/>
       <w:cols w:space="720"/>
+      <w:pgBorders w:offsetFrom="page">
+        <w:top w:val="single" w:sz="24" w:space="24" w:color="000000"/>
+        <w:left w:val="single" w:sz="24" w:space="24" w:color="000000"/>
+        <w:bottom w:val="single" w:sz="24" w:space="24" w:color="000000"/>
+        <w:right w:val="single" w:sz="24" w:space="24" w:color="000000"/>
+      </w:pgBorders>
     </w:sectPr>
   </w:body>
 </w:document>

</xml_diff>

<commit_message>
Add PREPARED BY section to cover page
https://claude.ai/code/session_01XNwruHkNzzkACBuMPFnptn
</commit_message>
<xml_diff>
--- a/contract_template.docx
+++ b/contract_template.docx
@@ -129,6 +129,121 @@
           <w:szCs w:val="22"/>
         </w:rPr>
         <w:t xml:space="preserve">………………………………………………………………………………………………………</w:t>
+      </w:r>
+    </w:p>
+    <w:p>
+      <w:pPr>
+        <w:ind w:left="4608"/>
+        <w:spacing w:before="400" w:after="0"/>
+      </w:pPr>
+    </w:p>
+    <w:p>
+      <w:pPr>
+        <w:ind w:left="4608"/>
+      </w:pPr>
+      <w:r>
+        <w:rPr>
+          <w:sz w:val="22"/>
+          <w:szCs w:val="22"/>
+          <w:b/>
+          <w:bCs/>
+        </w:rPr>
+        <w:t xml:space="preserve">PREPARED BY</w:t>
+      </w:r>
+    </w:p>
+    <w:p>
+      <w:pPr>
+        <w:ind w:left="4608"/>
+      </w:pPr>
+    </w:p>
+    <w:p>
+      <w:pPr>
+        <w:ind w:left="4608"/>
+      </w:pPr>
+      <w:r>
+        <w:rPr>
+          <w:sz w:val="22"/>
+          <w:szCs w:val="22"/>
+          <w:b/>
+          <w:bCs/>
+        </w:rPr>
+        <w:t xml:space="preserve">D. O AROWOSAFE Esq.</w:t>
+      </w:r>
+    </w:p>
+    <w:p>
+      <w:pPr>
+        <w:ind w:left="4608"/>
+      </w:pPr>
+    </w:p>
+    <w:p>
+      <w:pPr>
+        <w:ind w:left="4608"/>
+      </w:pPr>
+      <w:r>
+        <w:rPr>
+          <w:sz w:val="22"/>
+          <w:szCs w:val="22"/>
+          <w:b/>
+          <w:bCs/>
+        </w:rPr>
+        <w:t xml:space="preserve">FOR: LEGAL DEPARTMENT,</w:t>
+      </w:r>
+    </w:p>
+    <w:p>
+      <w:pPr>
+        <w:ind w:left="4608"/>
+      </w:pPr>
+    </w:p>
+    <w:p>
+      <w:pPr>
+        <w:ind w:left="4608"/>
+      </w:pPr>
+      <w:r>
+        <w:rPr>
+          <w:sz w:val="22"/>
+          <w:szCs w:val="22"/>
+          <w:b/>
+          <w:bCs/>
+        </w:rPr>
+        <w:t xml:space="preserve">LANDCULTURE INVESTMENT LTD,</w:t>
+      </w:r>
+    </w:p>
+    <w:p>
+      <w:pPr>
+        <w:ind w:left="4608"/>
+      </w:pPr>
+    </w:p>
+    <w:p>
+      <w:pPr>
+        <w:ind w:left="4608"/>
+      </w:pPr>
+      <w:r>
+        <w:rPr>
+          <w:sz w:val="22"/>
+          <w:szCs w:val="22"/>
+          <w:b/>
+          <w:bCs/>
+        </w:rPr>
+        <w:t xml:space="preserve">    PLOT 6, OLD JEBBA ROAD, BESIDE IPMAN BUILDING,</w:t>
+      </w:r>
+    </w:p>
+    <w:p>
+      <w:pPr>
+        <w:ind w:left="4608"/>
+      </w:pPr>
+    </w:p>
+    <w:p>
+      <w:pPr>
+        <w:ind w:left="4608"/>
+      </w:pPr>
+      <w:r>
+        <w:rPr>
+          <w:sz w:val="22"/>
+          <w:szCs w:val="22"/>
+          <w:b/>
+          <w:bCs/>
+        </w:rPr>
+        <w:t xml:space="preserve">SANGO, ILORIN, KWARA STATE.</w:t>
       </w:r>
     </w:p>
     <w:p>

</xml_diff>

<commit_message>
Border on cover page only — use section break to isolate border to first page
https://claude.ai/code/session_01XNwruHkNzzkACBuMPFnptn
</commit_message>
<xml_diff>
--- a/contract_template.docx
+++ b/contract_template.docx
@@ -236,6 +236,16 @@
       <w:pPr>
         <w:ind w:left="4608"/>
         <w:spacing w:after="4000"/>
+        <w:sectPr>
+          <w:pgSz w:w="12240" w:h="15840"/>
+          <w:pgMar w:top="759" w:right="1440" w:bottom="201" w:left="1440" w:header="720" w:footer="720" w:gutter="0"/>
+          <w:pgBorders w:offsetFrom="page">
+            <w:top w:val="single" w:sz="24" w:space="24" w:color="000000"/>
+            <w:left w:val="single" w:sz="24" w:space="24" w:color="000000"/>
+            <w:bottom w:val="single" w:sz="24" w:space="24" w:color="000000"/>
+            <w:right w:val="single" w:sz="24" w:space="24" w:color="000000"/>
+          </w:pgBorders>
+        </w:sectPr>
       </w:pPr>
       <w:r>
         <w:rPr>
@@ -245,11 +255,6 @@
           <w:bCs/>
         </w:rPr>
         <w:t xml:space="preserve">SANGO, ILORIN, KWARA STATE.</w:t>
-      </w:r>
-    </w:p>
-    <w:p>
-      <w:r>
-        <w:br w:type="page"/>
       </w:r>
     </w:p>
     <w:p>
@@ -4835,12 +4840,6 @@
       <w:pgSz w:w="12240" w:h="15840"/>
       <w:pgMar w:top="759" w:right="1440" w:bottom="201" w:left="1440" w:header="720" w:footer="720" w:gutter="0"/>
       <w:cols w:space="720"/>
-      <w:pgBorders w:offsetFrom="page">
-        <w:top w:val="single" w:sz="24" w:space="24" w:color="000000"/>
-        <w:left w:val="single" w:sz="24" w:space="24" w:color="000000"/>
-        <w:bottom w:val="single" w:sz="24" w:space="24" w:color="000000"/>
-        <w:right w:val="single" w:sz="24" w:space="24" w:color="000000"/>
-      </w:pgBorders>
     </w:sectPr>
   </w:body>
 </w:document>

</xml_diff>